<commit_message>
resume: add sync, capital one, earthmover; markdown copy for ai readers
Re-exported pdf/docx from the google doc. Coiled ends may 2024, page break
moved so the team lead role does not split.

Co-Authored-By: Claude Opus 5.5 <noreply@anthropic.com>
</commit_message>
<xml_diff>
--- a/frontend/public/Samantha_Hughes_Resume.docx
+++ b/frontend/public/Samantha_Hughes_Resume.docx
@@ -1,6 +1,6 @@
 
 <file path=word/document.xml><?xml version="1.0" encoding="utf-8"?>
-<w:document xmlns:mc="http://schemas.openxmlformats.org/markup-compatibility/2006" xmlns:o="urn:schemas-microsoft-com:office:office" xmlns:r="http://schemas.openxmlformats.org/officeDocument/2006/relationships" xmlns:m="http://schemas.openxmlformats.org/officeDocument/2006/math" xmlns:v="urn:schemas-microsoft-com:vml" xmlns:wp="http://schemas.openxmlformats.org/drawingml/2006/wordprocessingDrawing" xmlns:w10="urn:schemas-microsoft-com:office:word" xmlns:w="http://schemas.openxmlformats.org/wordprocessingml/2006/main" xmlns:wne="http://schemas.microsoft.com/office/word/2006/wordml" xmlns:sl="http://schemas.openxmlformats.org/schemaLibrary/2006/main" xmlns:a="http://schemas.openxmlformats.org/drawingml/2006/main" xmlns:pic="http://schemas.openxmlformats.org/drawingml/2006/picture" xmlns:c="http://schemas.openxmlformats.org/drawingml/2006/chart" xmlns:lc="http://schemas.openxmlformats.org/drawingml/2006/lockedCanvas" xmlns:dgm="http://schemas.openxmlformats.org/drawingml/2006/diagram" xmlns:wps="http://schemas.microsoft.com/office/word/2010/wordprocessingShape" xmlns:wpg="http://schemas.microsoft.com/office/word/2010/wordprocessingGroup" xmlns:w14="http://schemas.microsoft.com/office/word/2010/wordml" xmlns:w15="http://schemas.microsoft.com/office/word/2012/wordml">
+<w:document xmlns:mc="http://schemas.openxmlformats.org/markup-compatibility/2006" xmlns:o="urn:schemas-microsoft-com:office:office" xmlns:r="http://schemas.openxmlformats.org/officeDocument/2006/relationships" xmlns:m="http://schemas.openxmlformats.org/officeDocument/2006/math" xmlns:v="urn:schemas-microsoft-com:vml" xmlns:wp="http://schemas.openxmlformats.org/drawingml/2006/wordprocessingDrawing" xmlns:w10="urn:schemas-microsoft-com:office:word" xmlns:w="http://schemas.openxmlformats.org/wordprocessingml/2006/main" xmlns:wne="http://schemas.microsoft.com/office/word/2006/wordml" xmlns:sl="http://schemas.openxmlformats.org/schemaLibrary/2006/main" xmlns:a="http://schemas.openxmlformats.org/drawingml/2006/main" xmlns:pic="http://schemas.openxmlformats.org/drawingml/2006/picture" xmlns:c="http://schemas.openxmlformats.org/drawingml/2006/chart" xmlns:lc="http://schemas.openxmlformats.org/drawingml/2006/lockedCanvas" xmlns:dgm="http://schemas.openxmlformats.org/drawingml/2006/diagram" xmlns:wps="http://schemas.microsoft.com/office/word/2010/wordprocessingShape" xmlns:wpg="http://schemas.microsoft.com/office/word/2010/wordprocessingGroup" xmlns:w14="http://schemas.microsoft.com/office/word/2010/wordml" xmlns:w15="http://schemas.microsoft.com/office/word/2012/wordml" xmlns:w16="http://schemas.microsoft.com/office/word/2018/wordml" xmlns:w16cex="http://schemas.microsoft.com/office/word/2018/wordml/cex" xmlns:w16cid="http://schemas.microsoft.com/office/word/2016/wordml/cid" xmlns="http://schemas.microsoft.com/office/tasks/2019/documenttasks" xmlns:cr="http://schemas.microsoft.com/office/comments/2020/reactions">
   <w:body>
     <w:p>
       <w:pPr>
@@ -218,25 +218,13 @@
           <w:szCs w:val="24"/>
         </w:rPr>
       </w:pPr>
-      <w:bookmarkStart w:colFirst="0" w:colLast="0" w:name="_pb6klwujmetx" w:id="5"/>
+      <w:bookmarkStart w:colFirst="0" w:colLast="0" w:name="_4y025hr4fv3z" w:id="5"/>
       <w:bookmarkEnd w:id="5"/>
       <w:r>
         <w:rPr>
           <w:rtl w:val="0"/>
         </w:rPr>
-        <w:t xml:space="preserve">May 2022 </w:t>
-      </w:r>
-      <w:r>
-        <w:rPr>
-          <w:rtl w:val="0"/>
-        </w:rPr>
-        <w:t xml:space="preserve">-&gt;</w:t>
-      </w:r>
-      <w:r>
-        <w:rPr>
-          <w:rtl w:val="0"/>
-        </w:rPr>
-        <w:t xml:space="preserve"> Present</w:t>
+        <w:t xml:space="preserve">Sep 2025 -&gt; Present</w:t>
       </w:r>
       <w:r>
         <w:rPr>
@@ -248,17 +236,273 @@
       <w:pPr>
         <w:pStyle w:val="Heading3"/>
         <w:rPr>
+          <w:i w:val="1"/>
+          <w:iCs w:val="1"/>
+        </w:rPr>
+      </w:pPr>
+      <w:bookmarkStart w:colFirst="0" w:colLast="0" w:name="_cxg8a9wbkhre" w:id="6"/>
+      <w:bookmarkEnd w:id="6"/>
+      <w:r>
+        <w:rPr>
+          <w:b w:val="1"/>
+          <w:bCs w:val="1"/>
+          <w:rtl w:val="0"/>
+        </w:rPr>
+        <w:t xml:space="preserve">Earthmover</w:t>
+      </w:r>
+      <w:r>
+        <w:rPr>
+          <w:rtl w:val="0"/>
+        </w:rPr>
+        <w:t xml:space="preserve"> - </w:t>
+      </w:r>
+      <w:r>
+        <w:rPr>
+          <w:i w:val="1"/>
+          <w:iCs w:val="1"/>
+          <w:rtl w:val="0"/>
+        </w:rPr>
+        <w:t xml:space="preserve">Staff Software Engineer</w:t>
+      </w:r>
+      <w:r>
+        <w:rPr>
+          <w:rtl w:val="0"/>
+        </w:rPr>
+      </w:r>
+    </w:p>
+    <w:p>
+      <w:pPr>
+        <w:numPr>
+          <w:ilvl w:val="0"/>
+          <w:numId w:val="3"/>
+        </w:numPr>
+        <w:ind w:left="720" w:hanging="360"/>
+        <w:rPr>
+          <w:sz w:val="20"/>
+          <w:szCs w:val="20"/>
+        </w:rPr>
+      </w:pPr>
+      <w:r>
+        <w:rPr>
+          <w:rFonts w:ascii="Calibri" w:cs="Calibri" w:eastAsia="Calibri" w:hAnsi="Calibri"/>
+          <w:color w:val="434343"/>
+          <w:rtl w:val="0"/>
+        </w:rPr>
+        <w:t xml:space="preserve">Designed and built the customer compute control plane and the job platform for Arraylake, ran the ECS-to-EKS and MongoDB-to-Postgres migrations, and led a cost program that cut the AWS run rate about 45%.</w:t>
+      </w:r>
+      <w:r>
+        <w:rPr>
+          <w:rtl w:val="0"/>
+        </w:rPr>
+      </w:r>
+    </w:p>
+    <w:p>
+      <w:pPr>
+        <w:pStyle w:val="Heading3"/>
+        <w:rPr>
+          <w:sz w:val="24"/>
+          <w:szCs w:val="24"/>
+        </w:rPr>
+      </w:pPr>
+      <w:bookmarkStart w:colFirst="0" w:colLast="0" w:name="_y9pfyyiej69z" w:id="7"/>
+      <w:bookmarkEnd w:id="7"/>
+      <w:r>
+        <w:rPr>
+          <w:rtl w:val="0"/>
+        </w:rPr>
+        <w:t xml:space="preserve">Mar 2025 -&gt; Sep 2025</w:t>
+      </w:r>
+      <w:r>
+        <w:rPr>
+          <w:rtl w:val="0"/>
+        </w:rPr>
+      </w:r>
+    </w:p>
+    <w:p>
+      <w:pPr>
+        <w:pStyle w:val="Heading3"/>
+        <w:rPr>
+          <w:i w:val="1"/>
+          <w:iCs w:val="1"/>
+        </w:rPr>
+      </w:pPr>
+      <w:bookmarkStart w:colFirst="0" w:colLast="0" w:name="_i5h8toqa8she" w:id="8"/>
+      <w:bookmarkEnd w:id="8"/>
+      <w:r>
+        <w:rPr>
+          <w:b w:val="1"/>
+          <w:bCs w:val="1"/>
+          <w:rtl w:val="0"/>
+        </w:rPr>
+        <w:t xml:space="preserve">Capital One</w:t>
+      </w:r>
+      <w:r>
+        <w:rPr>
+          <w:rtl w:val="0"/>
+        </w:rPr>
+        <w:t xml:space="preserve"> - </w:t>
+      </w:r>
+      <w:r>
+        <w:rPr>
+          <w:i w:val="1"/>
+          <w:iCs w:val="1"/>
+          <w:rtl w:val="0"/>
+        </w:rPr>
+        <w:t xml:space="preserve">Senior Lead Software Engineer</w:t>
+      </w:r>
+    </w:p>
+    <w:p>
+      <w:pPr>
+        <w:numPr>
+          <w:ilvl w:val="0"/>
+          <w:numId w:val="3"/>
+        </w:numPr>
+        <w:ind w:left="720" w:hanging="360"/>
+        <w:rPr>
+          <w:sz w:val="20"/>
+          <w:szCs w:val="20"/>
+        </w:rPr>
+      </w:pPr>
+      <w:r>
+        <w:rPr>
+          <w:rFonts w:ascii="Calibri" w:cs="Calibri" w:eastAsia="Calibri" w:hAnsi="Calibri"/>
+          <w:color w:val="434343"/>
+          <w:rtl w:val="0"/>
+        </w:rPr>
+        <w:t xml:space="preserve">After the acquisition, led the rebuild of Sync Computing’s Databricks cost-optimization platform as Capital One’s Slingshot, shipped for the Databricks AI Summit.</w:t>
+      </w:r>
+      <w:r>
+        <w:rPr>
+          <w:rtl w:val="0"/>
+        </w:rPr>
+      </w:r>
+    </w:p>
+    <w:p>
+      <w:pPr>
+        <w:pStyle w:val="Heading3"/>
+        <w:rPr>
+          <w:sz w:val="24"/>
+          <w:szCs w:val="24"/>
+        </w:rPr>
+      </w:pPr>
+      <w:bookmarkStart w:colFirst="0" w:colLast="0" w:name="_spaj35yqu371" w:id="9"/>
+      <w:bookmarkEnd w:id="9"/>
+      <w:r>
+        <w:rPr>
+          <w:rtl w:val="0"/>
+        </w:rPr>
+        <w:t xml:space="preserve">Jun 2024 -&gt; Mar 2025</w:t>
+      </w:r>
+      <w:r>
+        <w:rPr>
+          <w:rtl w:val="0"/>
+        </w:rPr>
+      </w:r>
+    </w:p>
+    <w:p>
+      <w:pPr>
+        <w:pStyle w:val="Heading3"/>
+        <w:rPr>
+          <w:i w:val="1"/>
+          <w:iCs w:val="1"/>
+        </w:rPr>
+      </w:pPr>
+      <w:bookmarkStart w:colFirst="0" w:colLast="0" w:name="_g67fgf2d6wx" w:id="10"/>
+      <w:bookmarkEnd w:id="10"/>
+      <w:r>
+        <w:rPr>
+          <w:b w:val="1"/>
+          <w:bCs w:val="1"/>
+          <w:rtl w:val="0"/>
+        </w:rPr>
+        <w:t xml:space="preserve">Sync Computing</w:t>
+      </w:r>
+      <w:r>
+        <w:rPr>
+          <w:rtl w:val="0"/>
+        </w:rPr>
+        <w:t xml:space="preserve"> - </w:t>
+      </w:r>
+      <w:r>
+        <w:rPr>
+          <w:i w:val="1"/>
+          <w:iCs w:val="1"/>
+          <w:rtl w:val="0"/>
+        </w:rPr>
+        <w:t xml:space="preserve">Staff Software Engineer</w:t>
+      </w:r>
+      <w:r>
+        <w:rPr>
+          <w:rtl w:val="0"/>
+        </w:rPr>
+      </w:r>
+    </w:p>
+    <w:p>
+      <w:pPr>
+        <w:numPr>
+          <w:ilvl w:val="0"/>
+          <w:numId w:val="3"/>
+        </w:numPr>
+        <w:ind w:left="720" w:hanging="360"/>
+        <w:rPr>
+          <w:sz w:val="20"/>
+          <w:szCs w:val="20"/>
+        </w:rPr>
+      </w:pPr>
+      <w:r>
+        <w:rPr>
+          <w:rFonts w:ascii="Calibri" w:cs="Calibri" w:eastAsia="Calibri" w:hAnsi="Calibri"/>
+          <w:color w:val="434343"/>
+          <w:rtl w:val="0"/>
+        </w:rPr>
+        <w:t xml:space="preserve">Rebuilt the monitoring and infrastructure stack for enterprise-scale workloads, which unblocked a large enterprise onboarding and readied the product for acquisition by Capital One.</w:t>
+      </w:r>
+      <w:r>
+        <w:rPr>
+          <w:rtl w:val="0"/>
+        </w:rPr>
+      </w:r>
+    </w:p>
+    <w:p>
+      <w:pPr>
+        <w:pStyle w:val="Heading3"/>
+        <w:rPr>
+          <w:sz w:val="24"/>
+          <w:szCs w:val="24"/>
+        </w:rPr>
+      </w:pPr>
+      <w:bookmarkStart w:colFirst="0" w:colLast="0" w:name="_pb6klwujmetx" w:id="11"/>
+      <w:bookmarkEnd w:id="11"/>
+      <w:r>
+        <w:rPr>
+          <w:rtl w:val="0"/>
+        </w:rPr>
+        <w:t xml:space="preserve">May 2022 -&gt; May 2024</w:t>
+      </w:r>
+      <w:r>
+        <w:rPr>
+          <w:rtl w:val="0"/>
+        </w:rPr>
+      </w:r>
+    </w:p>
+    <w:p>
+      <w:pPr>
+        <w:pStyle w:val="Heading3"/>
+        <w:rPr>
           <w:rFonts w:ascii="Calibri" w:cs="Calibri" w:eastAsia="Calibri" w:hAnsi="Calibri"/>
           <w:b w:val="0"/>
+          <w:bCs w:val="0"/>
           <w:i w:val="1"/>
-          <w:color w:val="434343"/>
-        </w:rPr>
-      </w:pPr>
-      <w:bookmarkStart w:colFirst="0" w:colLast="0" w:name="_mofu6vopi18q" w:id="6"/>
-      <w:bookmarkEnd w:id="6"/>
+          <w:iCs w:val="1"/>
+          <w:color w:val="434343"/>
+        </w:rPr>
+      </w:pPr>
+      <w:bookmarkStart w:colFirst="0" w:colLast="0" w:name="_mofu6vopi18q" w:id="12"/>
+      <w:bookmarkEnd w:id="12"/>
       <w:r>
         <w:rPr>
           <w:b w:val="1"/>
+          <w:bCs w:val="1"/>
           <w:color w:val="434343"/>
           <w:rtl w:val="0"/>
         </w:rPr>
@@ -276,6 +520,7 @@
         <w:rPr>
           <w:rFonts w:ascii="Calibri" w:cs="Calibri" w:eastAsia="Calibri" w:hAnsi="Calibri"/>
           <w:b w:val="0"/>
+          <w:bCs w:val="0"/>
           <w:color w:val="434343"/>
           <w:rtl w:val="0"/>
         </w:rPr>
@@ -293,7 +538,9 @@
         <w:rPr>
           <w:rFonts w:ascii="Calibri" w:cs="Calibri" w:eastAsia="Calibri" w:hAnsi="Calibri"/>
           <w:b w:val="0"/>
+          <w:bCs w:val="0"/>
           <w:i w:val="1"/>
+          <w:iCs w:val="1"/>
           <w:color w:val="434343"/>
           <w:rtl w:val="0"/>
         </w:rPr>
@@ -509,8 +756,25 @@
         <w:spacing w:before="0" w:line="240" w:lineRule="auto"/>
         <w:rPr/>
       </w:pPr>
-      <w:bookmarkStart w:colFirst="0" w:colLast="0" w:name="_i6o0sra49zfi" w:id="7"/>
-      <w:bookmarkEnd w:id="7"/>
+      <w:bookmarkStart w:colFirst="0" w:colLast="0" w:name="_uqbkj5enxzec" w:id="13"/>
+      <w:bookmarkEnd w:id="13"/>
+      <w:r>
+        <w:br w:type="page"/>
+      </w:r>
+      <w:r>
+        <w:rPr>
+          <w:rtl w:val="0"/>
+        </w:rPr>
+      </w:r>
+    </w:p>
+    <w:p>
+      <w:pPr>
+        <w:pStyle w:val="Heading3"/>
+        <w:spacing w:before="0" w:line="240" w:lineRule="auto"/>
+        <w:rPr/>
+      </w:pPr>
+      <w:bookmarkStart w:colFirst="0" w:colLast="0" w:name="_i6o0sra49zfi" w:id="14"/>
+      <w:bookmarkEnd w:id="14"/>
       <w:r>
         <w:rPr>
           <w:rtl w:val="0"/>
@@ -524,6 +788,7 @@
         <w:rPr>
           <w:rFonts w:ascii="Calibri" w:cs="Calibri" w:eastAsia="Calibri" w:hAnsi="Calibri"/>
           <w:i w:val="1"/>
+          <w:iCs w:val="1"/>
           <w:color w:val="434343"/>
           <w:sz w:val="22"/>
           <w:szCs w:val="22"/>
@@ -533,6 +798,7 @@
         <w:rPr>
           <w:rFonts w:ascii="Calibri" w:cs="Calibri" w:eastAsia="Calibri" w:hAnsi="Calibri"/>
           <w:b w:val="1"/>
+          <w:bCs w:val="1"/>
           <w:color w:val="434343"/>
           <w:sz w:val="22"/>
           <w:szCs w:val="22"/>
@@ -554,6 +820,7 @@
         <w:rPr>
           <w:rFonts w:ascii="Calibri" w:cs="Calibri" w:eastAsia="Calibri" w:hAnsi="Calibri"/>
           <w:i w:val="1"/>
+          <w:iCs w:val="1"/>
           <w:color w:val="434343"/>
           <w:sz w:val="22"/>
           <w:szCs w:val="22"/>
@@ -617,8 +884,8 @@
         <w:spacing w:line="240" w:lineRule="auto"/>
         <w:rPr/>
       </w:pPr>
-      <w:bookmarkStart w:colFirst="0" w:colLast="0" w:name="_wswn86fbay28" w:id="8"/>
-      <w:bookmarkEnd w:id="8"/>
+      <w:bookmarkStart w:colFirst="0" w:colLast="0" w:name="_wswn86fbay28" w:id="15"/>
+      <w:bookmarkEnd w:id="15"/>
       <w:r>
         <w:rPr>
           <w:rtl w:val="0"/>
@@ -633,6 +900,7 @@
         <w:rPr>
           <w:rFonts w:ascii="Calibri" w:cs="Calibri" w:eastAsia="Calibri" w:hAnsi="Calibri"/>
           <w:i w:val="1"/>
+          <w:iCs w:val="1"/>
           <w:color w:val="434343"/>
           <w:sz w:val="22"/>
           <w:szCs w:val="22"/>
@@ -642,6 +910,7 @@
         <w:rPr>
           <w:rFonts w:ascii="Calibri" w:cs="Calibri" w:eastAsia="Calibri" w:hAnsi="Calibri"/>
           <w:b w:val="1"/>
+          <w:bCs w:val="1"/>
           <w:color w:val="434343"/>
           <w:sz w:val="22"/>
           <w:szCs w:val="22"/>
@@ -653,6 +922,7 @@
         <w:rPr>
           <w:rFonts w:ascii="Calibri" w:cs="Calibri" w:eastAsia="Calibri" w:hAnsi="Calibri"/>
           <w:i w:val="1"/>
+          <w:iCs w:val="1"/>
           <w:color w:val="434343"/>
           <w:sz w:val="22"/>
           <w:szCs w:val="22"/>
@@ -764,39 +1034,11 @@
     </w:p>
     <w:p>
       <w:pPr>
-        <w:pStyle w:val="Heading2"/>
-        <w:pageBreakBefore w:val="0"/>
-        <w:pBdr>
-          <w:top w:space="0" w:sz="0" w:val="nil"/>
-          <w:left w:space="0" w:sz="0" w:val="nil"/>
-          <w:bottom w:space="0" w:sz="0" w:val="nil"/>
-          <w:right w:space="0" w:sz="0" w:val="nil"/>
-          <w:between w:space="0" w:sz="0" w:val="nil"/>
-        </w:pBdr>
-        <w:shd w:fill="auto" w:val="clear"/>
-        <w:rPr>
-          <w:rFonts w:ascii="Calibri" w:cs="Calibri" w:eastAsia="Calibri" w:hAnsi="Calibri"/>
-          <w:color w:val="434343"/>
-        </w:rPr>
-      </w:pPr>
-      <w:bookmarkStart w:colFirst="0" w:colLast="0" w:name="_kdo1727fhasy" w:id="9"/>
-      <w:bookmarkEnd w:id="9"/>
-      <w:r>
-        <w:br w:type="page"/>
-      </w:r>
-      <w:r>
-        <w:rPr>
-          <w:rtl w:val="0"/>
-        </w:rPr>
-      </w:r>
-    </w:p>
-    <w:p>
-      <w:pPr>
         <w:pStyle w:val="Heading3"/>
         <w:rPr/>
       </w:pPr>
-      <w:bookmarkStart w:colFirst="0" w:colLast="0" w:name="_9hamueqzod31" w:id="10"/>
-      <w:bookmarkEnd w:id="10"/>
+      <w:bookmarkStart w:colFirst="0" w:colLast="0" w:name="_9hamueqzod31" w:id="16"/>
+      <w:bookmarkEnd w:id="16"/>
       <w:r>
         <w:rPr>
           <w:rtl w:val="0"/>
@@ -824,15 +1066,18 @@
         <w:rPr>
           <w:rFonts w:ascii="Calibri" w:cs="Calibri" w:eastAsia="Calibri" w:hAnsi="Calibri"/>
           <w:b w:val="0"/>
+          <w:bCs w:val="0"/>
           <w:i w:val="1"/>
-          <w:color w:val="434343"/>
-        </w:rPr>
-      </w:pPr>
-      <w:bookmarkStart w:colFirst="0" w:colLast="0" w:name="_klvjjwvj40i3" w:id="11"/>
-      <w:bookmarkEnd w:id="11"/>
+          <w:iCs w:val="1"/>
+          <w:color w:val="434343"/>
+        </w:rPr>
+      </w:pPr>
+      <w:bookmarkStart w:colFirst="0" w:colLast="0" w:name="_klvjjwvj40i3" w:id="17"/>
+      <w:bookmarkEnd w:id="17"/>
       <w:r>
         <w:rPr>
           <w:b w:val="1"/>
+          <w:bCs w:val="1"/>
           <w:color w:val="434343"/>
           <w:rtl w:val="0"/>
         </w:rPr>
@@ -842,7 +1087,9 @@
         <w:rPr>
           <w:rFonts w:ascii="Calibri" w:cs="Calibri" w:eastAsia="Calibri" w:hAnsi="Calibri"/>
           <w:b w:val="0"/>
+          <w:bCs w:val="0"/>
           <w:i w:val="1"/>
+          <w:iCs w:val="1"/>
           <w:color w:val="434343"/>
           <w:rtl w:val="0"/>
         </w:rPr>
@@ -853,7 +1100,7 @@
       <w:pPr>
         <w:numPr>
           <w:ilvl w:val="0"/>
-          <w:numId w:val="4"/>
+          <w:numId w:val="2"/>
         </w:numPr>
         <w:spacing w:after="0" w:afterAutospacing="0" w:before="240" w:lineRule="auto"/>
         <w:ind w:left="720" w:hanging="360"/>
@@ -885,7 +1132,7 @@
       <w:pPr>
         <w:numPr>
           <w:ilvl w:val="0"/>
-          <w:numId w:val="4"/>
+          <w:numId w:val="2"/>
         </w:numPr>
         <w:spacing w:after="240" w:before="0" w:beforeAutospacing="0" w:lineRule="auto"/>
         <w:ind w:left="720" w:hanging="360"/>
@@ -918,8 +1165,8 @@
         <w:pStyle w:val="Heading3"/>
         <w:rPr/>
       </w:pPr>
-      <w:bookmarkStart w:colFirst="0" w:colLast="0" w:name="_8p24tzp33ejg" w:id="12"/>
-      <w:bookmarkEnd w:id="12"/>
+      <w:bookmarkStart w:colFirst="0" w:colLast="0" w:name="_8p24tzp33ejg" w:id="18"/>
+      <w:bookmarkEnd w:id="18"/>
       <w:r>
         <w:rPr>
           <w:rtl w:val="0"/>
@@ -947,15 +1194,18 @@
         <w:rPr>
           <w:rFonts w:ascii="Calibri" w:cs="Calibri" w:eastAsia="Calibri" w:hAnsi="Calibri"/>
           <w:b w:val="0"/>
+          <w:bCs w:val="0"/>
           <w:i w:val="1"/>
-          <w:color w:val="434343"/>
-        </w:rPr>
-      </w:pPr>
-      <w:bookmarkStart w:colFirst="0" w:colLast="0" w:name="_2mwrupb75gpr" w:id="13"/>
-      <w:bookmarkEnd w:id="13"/>
+          <w:iCs w:val="1"/>
+          <w:color w:val="434343"/>
+        </w:rPr>
+      </w:pPr>
+      <w:bookmarkStart w:colFirst="0" w:colLast="0" w:name="_2mwrupb75gpr" w:id="19"/>
+      <w:bookmarkEnd w:id="19"/>
       <w:r>
         <w:rPr>
           <w:b w:val="1"/>
+          <w:bCs w:val="1"/>
           <w:color w:val="434343"/>
           <w:rtl w:val="0"/>
         </w:rPr>
@@ -965,7 +1215,9 @@
         <w:rPr>
           <w:rFonts w:ascii="Calibri" w:cs="Calibri" w:eastAsia="Calibri" w:hAnsi="Calibri"/>
           <w:b w:val="0"/>
+          <w:bCs w:val="0"/>
           <w:i w:val="1"/>
+          <w:iCs w:val="1"/>
           <w:color w:val="434343"/>
           <w:rtl w:val="0"/>
         </w:rPr>
@@ -976,7 +1228,7 @@
       <w:pPr>
         <w:numPr>
           <w:ilvl w:val="0"/>
-          <w:numId w:val="2"/>
+          <w:numId w:val="4"/>
         </w:numPr>
         <w:spacing w:after="0" w:afterAutospacing="0" w:before="240" w:lineRule="auto"/>
         <w:ind w:left="720" w:hanging="360"/>
@@ -1028,7 +1280,7 @@
       <w:pPr>
         <w:numPr>
           <w:ilvl w:val="0"/>
-          <w:numId w:val="2"/>
+          <w:numId w:val="4"/>
         </w:numPr>
         <w:spacing w:after="240" w:before="0" w:beforeAutospacing="0" w:lineRule="auto"/>
         <w:ind w:left="720" w:hanging="360"/>
@@ -1062,8 +1314,8 @@
           <w:color w:val="434343"/>
         </w:rPr>
       </w:pPr>
-      <w:bookmarkStart w:colFirst="0" w:colLast="0" w:name="_k97xo0qx7jdm" w:id="14"/>
-      <w:bookmarkEnd w:id="14"/>
+      <w:bookmarkStart w:colFirst="0" w:colLast="0" w:name="_k97xo0qx7jdm" w:id="20"/>
+      <w:bookmarkEnd w:id="20"/>
       <w:r>
         <w:rPr>
           <w:rFonts w:ascii="Calibri" w:cs="Calibri" w:eastAsia="Calibri" w:hAnsi="Calibri"/>
@@ -1083,8 +1335,8 @@
         <w:pStyle w:val="Heading3"/>
         <w:rPr/>
       </w:pPr>
-      <w:bookmarkStart w:colFirst="0" w:colLast="0" w:name="_v9j91n2fon3f" w:id="15"/>
-      <w:bookmarkEnd w:id="15"/>
+      <w:bookmarkStart w:colFirst="0" w:colLast="0" w:name="_v9j91n2fon3f" w:id="21"/>
+      <w:bookmarkEnd w:id="21"/>
       <w:commentRangeStart w:id="0"/>
       <w:commentRangeStart w:id="1"/>
       <w:commentRangeStart w:id="2"/>
@@ -1132,15 +1384,18 @@
         <w:rPr>
           <w:rFonts w:ascii="Calibri" w:cs="Calibri" w:eastAsia="Calibri" w:hAnsi="Calibri"/>
           <w:b w:val="0"/>
+          <w:bCs w:val="0"/>
           <w:i w:val="1"/>
-          <w:color w:val="434343"/>
-        </w:rPr>
-      </w:pPr>
-      <w:bookmarkStart w:colFirst="0" w:colLast="0" w:name="_78rlvk1sif5a" w:id="16"/>
-      <w:bookmarkEnd w:id="16"/>
+          <w:iCs w:val="1"/>
+          <w:color w:val="434343"/>
+        </w:rPr>
+      </w:pPr>
+      <w:bookmarkStart w:colFirst="0" w:colLast="0" w:name="_78rlvk1sif5a" w:id="22"/>
+      <w:bookmarkEnd w:id="22"/>
       <w:r>
         <w:rPr>
           <w:b w:val="1"/>
+          <w:bCs w:val="1"/>
           <w:color w:val="434343"/>
           <w:rtl w:val="0"/>
         </w:rPr>
@@ -1158,7 +1413,9 @@
         <w:rPr>
           <w:rFonts w:ascii="Calibri" w:cs="Calibri" w:eastAsia="Calibri" w:hAnsi="Calibri"/>
           <w:b w:val="0"/>
+          <w:bCs w:val="0"/>
           <w:i w:val="1"/>
+          <w:iCs w:val="1"/>
           <w:color w:val="434343"/>
           <w:rtl w:val="0"/>
         </w:rPr>
@@ -1183,8 +1440,8 @@
           <w:color w:val="434343"/>
         </w:rPr>
       </w:pPr>
-      <w:bookmarkStart w:colFirst="0" w:colLast="0" w:name="_txda8vxduhlz" w:id="17"/>
-      <w:bookmarkEnd w:id="17"/>
+      <w:bookmarkStart w:colFirst="0" w:colLast="0" w:name="_txda8vxduhlz" w:id="23"/>
+      <w:bookmarkEnd w:id="23"/>
       <w:r>
         <w:rPr>
           <w:rtl w:val="0"/>
@@ -1202,7 +1459,7 @@
 </file>
 
 <file path=word/comments.xml><?xml version="1.0" encoding="utf-8"?>
-<w:comments xmlns:mc="http://schemas.openxmlformats.org/markup-compatibility/2006" xmlns:o="urn:schemas-microsoft-com:office:office" xmlns:r="http://schemas.openxmlformats.org/officeDocument/2006/relationships" xmlns:m="http://schemas.openxmlformats.org/officeDocument/2006/math" xmlns:v="urn:schemas-microsoft-com:vml" xmlns:wp="http://schemas.openxmlformats.org/drawingml/2006/wordprocessingDrawing" xmlns:w10="urn:schemas-microsoft-com:office:word" xmlns:w="http://schemas.openxmlformats.org/wordprocessingml/2006/main" xmlns:wne="http://schemas.microsoft.com/office/word/2006/wordml" xmlns:sl="http://schemas.openxmlformats.org/schemaLibrary/2006/main" xmlns:a="http://schemas.openxmlformats.org/drawingml/2006/main" xmlns:pic="http://schemas.openxmlformats.org/drawingml/2006/picture" xmlns:c="http://schemas.openxmlformats.org/drawingml/2006/chart" xmlns:lc="http://schemas.openxmlformats.org/drawingml/2006/lockedCanvas" xmlns:dgm="http://schemas.openxmlformats.org/drawingml/2006/diagram" xmlns:wps="http://schemas.microsoft.com/office/word/2010/wordprocessingShape" xmlns:wpg="http://schemas.microsoft.com/office/word/2010/wordprocessingGroup" xmlns:w14="http://schemas.microsoft.com/office/word/2010/wordml" xmlns:w15="http://schemas.microsoft.com/office/word/2012/wordml">
+<w:comments xmlns:mc="http://schemas.openxmlformats.org/markup-compatibility/2006" xmlns:o="urn:schemas-microsoft-com:office:office" xmlns:r="http://schemas.openxmlformats.org/officeDocument/2006/relationships" xmlns:m="http://schemas.openxmlformats.org/officeDocument/2006/math" xmlns:v="urn:schemas-microsoft-com:vml" xmlns:wp="http://schemas.openxmlformats.org/drawingml/2006/wordprocessingDrawing" xmlns:w10="urn:schemas-microsoft-com:office:word" xmlns:w="http://schemas.openxmlformats.org/wordprocessingml/2006/main" xmlns:wne="http://schemas.microsoft.com/office/word/2006/wordml" xmlns:sl="http://schemas.openxmlformats.org/schemaLibrary/2006/main" xmlns:a="http://schemas.openxmlformats.org/drawingml/2006/main" xmlns:pic="http://schemas.openxmlformats.org/drawingml/2006/picture" xmlns:c="http://schemas.openxmlformats.org/drawingml/2006/chart" xmlns:lc="http://schemas.openxmlformats.org/drawingml/2006/lockedCanvas" xmlns:dgm="http://schemas.openxmlformats.org/drawingml/2006/diagram" xmlns:wps="http://schemas.microsoft.com/office/word/2010/wordprocessingShape" xmlns:wpg="http://schemas.microsoft.com/office/word/2010/wordprocessingGroup" xmlns:w14="http://schemas.microsoft.com/office/word/2010/wordml" xmlns:w15="http://schemas.microsoft.com/office/word/2012/wordml" xmlns:w16="http://schemas.microsoft.com/office/word/2018/wordml" xmlns:w16cex="http://schemas.microsoft.com/office/word/2018/wordml/cex" xmlns:w16cid="http://schemas.microsoft.com/office/word/2016/wordml/cid" xmlns="http://schemas.microsoft.com/office/tasks/2019/documenttasks" xmlns:cr="http://schemas.microsoft.com/office/comments/2020/reactions">
   <w:comment w:author="Amy Smith" w:id="0" w:date="2024-04-18T20:28:13Z">
     <w:p>
       <w:pPr>
@@ -1224,7 +1481,9 @@
         <w:rPr>
           <w:rFonts w:ascii="Arial" w:cs="Arial" w:eastAsia="Arial" w:hAnsi="Arial"/>
           <w:b w:val="0"/>
+          <w:bCs w:val="0"/>
           <w:i w:val="0"/>
+          <w:iCs w:val="0"/>
           <w:smallCaps w:val="0"/>
           <w:strike w:val="0"/>
           <w:color w:val="000000"/>
@@ -1239,7 +1498,9 @@
         <w:rPr>
           <w:rFonts w:ascii="Arial" w:cs="Arial" w:eastAsia="Arial" w:hAnsi="Arial"/>
           <w:b w:val="0"/>
+          <w:bCs w:val="0"/>
           <w:i w:val="0"/>
+          <w:iCs w:val="0"/>
           <w:smallCaps w:val="0"/>
           <w:strike w:val="0"/>
           <w:color w:val="000000"/>
@@ -1275,7 +1536,9 @@
         <w:rPr>
           <w:rFonts w:ascii="Arial" w:cs="Arial" w:eastAsia="Arial" w:hAnsi="Arial"/>
           <w:b w:val="0"/>
+          <w:bCs w:val="0"/>
           <w:i w:val="0"/>
+          <w:iCs w:val="0"/>
           <w:smallCaps w:val="0"/>
           <w:strike w:val="0"/>
           <w:color w:val="000000"/>
@@ -1290,7 +1553,9 @@
         <w:rPr>
           <w:rFonts w:ascii="Arial" w:cs="Arial" w:eastAsia="Arial" w:hAnsi="Arial"/>
           <w:b w:val="0"/>
+          <w:bCs w:val="0"/>
           <w:i w:val="0"/>
+          <w:iCs w:val="0"/>
           <w:smallCaps w:val="0"/>
           <w:strike w:val="0"/>
           <w:color w:val="000000"/>
@@ -1326,7 +1591,9 @@
         <w:rPr>
           <w:rFonts w:ascii="Arial" w:cs="Arial" w:eastAsia="Arial" w:hAnsi="Arial"/>
           <w:b w:val="0"/>
+          <w:bCs w:val="0"/>
           <w:i w:val="0"/>
+          <w:iCs w:val="0"/>
           <w:smallCaps w:val="0"/>
           <w:strike w:val="0"/>
           <w:color w:val="000000"/>
@@ -1341,7 +1608,9 @@
         <w:rPr>
           <w:rFonts w:ascii="Arial" w:cs="Arial" w:eastAsia="Arial" w:hAnsi="Arial"/>
           <w:b w:val="0"/>
+          <w:bCs w:val="0"/>
           <w:i w:val="0"/>
+          <w:iCs w:val="0"/>
           <w:smallCaps w:val="0"/>
           <w:strike w:val="0"/>
           <w:color w:val="000000"/>
@@ -1377,7 +1646,9 @@
         <w:rPr>
           <w:rFonts w:ascii="Arial" w:cs="Arial" w:eastAsia="Arial" w:hAnsi="Arial"/>
           <w:b w:val="0"/>
+          <w:bCs w:val="0"/>
           <w:i w:val="0"/>
+          <w:iCs w:val="0"/>
           <w:smallCaps w:val="0"/>
           <w:strike w:val="0"/>
           <w:color w:val="000000"/>
@@ -1392,7 +1663,9 @@
         <w:rPr>
           <w:rFonts w:ascii="Arial" w:cs="Arial" w:eastAsia="Arial" w:hAnsi="Arial"/>
           <w:b w:val="0"/>
+          <w:bCs w:val="0"/>
           <w:i w:val="0"/>
+          <w:iCs w:val="0"/>
           <w:smallCaps w:val="0"/>
           <w:strike w:val="0"/>
           <w:color w:val="000000"/>
@@ -1411,7 +1684,7 @@
 </file>
 
 <file path=word/footer1.xml><?xml version="1.0" encoding="utf-8"?>
-<w:ftr xmlns:mc="http://schemas.openxmlformats.org/markup-compatibility/2006" xmlns:o="urn:schemas-microsoft-com:office:office" xmlns:r="http://schemas.openxmlformats.org/officeDocument/2006/relationships" xmlns:m="http://schemas.openxmlformats.org/officeDocument/2006/math" xmlns:v="urn:schemas-microsoft-com:vml" xmlns:wp="http://schemas.openxmlformats.org/drawingml/2006/wordprocessingDrawing" xmlns:w10="urn:schemas-microsoft-com:office:word" xmlns:w="http://schemas.openxmlformats.org/wordprocessingml/2006/main" xmlns:wne="http://schemas.microsoft.com/office/word/2006/wordml" xmlns:sl="http://schemas.openxmlformats.org/schemaLibrary/2006/main" xmlns:a="http://schemas.openxmlformats.org/drawingml/2006/main" xmlns:pic="http://schemas.openxmlformats.org/drawingml/2006/picture" xmlns:c="http://schemas.openxmlformats.org/drawingml/2006/chart" xmlns:lc="http://schemas.openxmlformats.org/drawingml/2006/lockedCanvas" xmlns:dgm="http://schemas.openxmlformats.org/drawingml/2006/diagram" xmlns:wps="http://schemas.microsoft.com/office/word/2010/wordprocessingShape" xmlns:wpg="http://schemas.microsoft.com/office/word/2010/wordprocessingGroup" xmlns:w14="http://schemas.microsoft.com/office/word/2010/wordml" xmlns:w15="http://schemas.microsoft.com/office/word/2012/wordml">
+<w:ftr xmlns:mc="http://schemas.openxmlformats.org/markup-compatibility/2006" xmlns:o="urn:schemas-microsoft-com:office:office" xmlns:r="http://schemas.openxmlformats.org/officeDocument/2006/relationships" xmlns:m="http://schemas.openxmlformats.org/officeDocument/2006/math" xmlns:v="urn:schemas-microsoft-com:vml" xmlns:wp="http://schemas.openxmlformats.org/drawingml/2006/wordprocessingDrawing" xmlns:w10="urn:schemas-microsoft-com:office:word" xmlns:w="http://schemas.openxmlformats.org/wordprocessingml/2006/main" xmlns:wne="http://schemas.microsoft.com/office/word/2006/wordml" xmlns:sl="http://schemas.openxmlformats.org/schemaLibrary/2006/main" xmlns:a="http://schemas.openxmlformats.org/drawingml/2006/main" xmlns:pic="http://schemas.openxmlformats.org/drawingml/2006/picture" xmlns:c="http://schemas.openxmlformats.org/drawingml/2006/chart" xmlns:lc="http://schemas.openxmlformats.org/drawingml/2006/lockedCanvas" xmlns:dgm="http://schemas.openxmlformats.org/drawingml/2006/diagram" xmlns:wps="http://schemas.microsoft.com/office/word/2010/wordprocessingShape" xmlns:wpg="http://schemas.microsoft.com/office/word/2010/wordprocessingGroup" xmlns:w14="http://schemas.microsoft.com/office/word/2010/wordml" xmlns:w15="http://schemas.microsoft.com/office/word/2012/wordml" xmlns:w16="http://schemas.microsoft.com/office/word/2018/wordml" xmlns:w16cex="http://schemas.microsoft.com/office/word/2018/wordml/cex" xmlns:w16cid="http://schemas.microsoft.com/office/word/2016/wordml/cid" xmlns="http://schemas.microsoft.com/office/tasks/2019/documenttasks" xmlns:cr="http://schemas.microsoft.com/office/comments/2020/reactions">
   <w:p>
     <w:pPr>
       <w:pageBreakBefore w:val="0"/>
@@ -1435,7 +1708,7 @@
 </file>
 
 <file path=word/header1.xml><?xml version="1.0" encoding="utf-8"?>
-<w:hdr xmlns:mc="http://schemas.openxmlformats.org/markup-compatibility/2006" xmlns:o="urn:schemas-microsoft-com:office:office" xmlns:r="http://schemas.openxmlformats.org/officeDocument/2006/relationships" xmlns:m="http://schemas.openxmlformats.org/officeDocument/2006/math" xmlns:v="urn:schemas-microsoft-com:vml" xmlns:wp="http://schemas.openxmlformats.org/drawingml/2006/wordprocessingDrawing" xmlns:w10="urn:schemas-microsoft-com:office:word" xmlns:w="http://schemas.openxmlformats.org/wordprocessingml/2006/main" xmlns:wne="http://schemas.microsoft.com/office/word/2006/wordml" xmlns:sl="http://schemas.openxmlformats.org/schemaLibrary/2006/main" xmlns:a="http://schemas.openxmlformats.org/drawingml/2006/main" xmlns:pic="http://schemas.openxmlformats.org/drawingml/2006/picture" xmlns:c="http://schemas.openxmlformats.org/drawingml/2006/chart" xmlns:lc="http://schemas.openxmlformats.org/drawingml/2006/lockedCanvas" xmlns:dgm="http://schemas.openxmlformats.org/drawingml/2006/diagram" xmlns:wps="http://schemas.microsoft.com/office/word/2010/wordprocessingShape" xmlns:wpg="http://schemas.microsoft.com/office/word/2010/wordprocessingGroup" xmlns:w14="http://schemas.microsoft.com/office/word/2010/wordml" xmlns:w15="http://schemas.microsoft.com/office/word/2012/wordml">
+<w:hdr xmlns:mc="http://schemas.openxmlformats.org/markup-compatibility/2006" xmlns:o="urn:schemas-microsoft-com:office:office" xmlns:r="http://schemas.openxmlformats.org/officeDocument/2006/relationships" xmlns:m="http://schemas.openxmlformats.org/officeDocument/2006/math" xmlns:v="urn:schemas-microsoft-com:vml" xmlns:wp="http://schemas.openxmlformats.org/drawingml/2006/wordprocessingDrawing" xmlns:w10="urn:schemas-microsoft-com:office:word" xmlns:w="http://schemas.openxmlformats.org/wordprocessingml/2006/main" xmlns:wne="http://schemas.microsoft.com/office/word/2006/wordml" xmlns:sl="http://schemas.openxmlformats.org/schemaLibrary/2006/main" xmlns:a="http://schemas.openxmlformats.org/drawingml/2006/main" xmlns:pic="http://schemas.openxmlformats.org/drawingml/2006/picture" xmlns:c="http://schemas.openxmlformats.org/drawingml/2006/chart" xmlns:lc="http://schemas.openxmlformats.org/drawingml/2006/lockedCanvas" xmlns:dgm="http://schemas.openxmlformats.org/drawingml/2006/diagram" xmlns:wps="http://schemas.microsoft.com/office/word/2010/wordprocessingShape" xmlns:wpg="http://schemas.microsoft.com/office/word/2010/wordprocessingGroup" xmlns:w14="http://schemas.microsoft.com/office/word/2010/wordml" xmlns:w15="http://schemas.microsoft.com/office/word/2012/wordml" xmlns:w16="http://schemas.microsoft.com/office/word/2018/wordml" xmlns:w16cex="http://schemas.microsoft.com/office/word/2018/wordml/cex" xmlns:w16cid="http://schemas.microsoft.com/office/word/2016/wordml/cid" xmlns="http://schemas.microsoft.com/office/tasks/2019/documenttasks" xmlns:cr="http://schemas.microsoft.com/office/comments/2020/reactions">
   <w:p>
     <w:pPr>
       <w:pageBreakBefore w:val="0"/>
@@ -1463,7 +1736,7 @@
 </file>
 
 <file path=word/header2.xml><?xml version="1.0" encoding="utf-8"?>
-<w:hdr xmlns:mc="http://schemas.openxmlformats.org/markup-compatibility/2006" xmlns:o="urn:schemas-microsoft-com:office:office" xmlns:r="http://schemas.openxmlformats.org/officeDocument/2006/relationships" xmlns:m="http://schemas.openxmlformats.org/officeDocument/2006/math" xmlns:v="urn:schemas-microsoft-com:vml" xmlns:wp="http://schemas.openxmlformats.org/drawingml/2006/wordprocessingDrawing" xmlns:w10="urn:schemas-microsoft-com:office:word" xmlns:w="http://schemas.openxmlformats.org/wordprocessingml/2006/main" xmlns:wne="http://schemas.microsoft.com/office/word/2006/wordml" xmlns:sl="http://schemas.openxmlformats.org/schemaLibrary/2006/main" xmlns:a="http://schemas.openxmlformats.org/drawingml/2006/main" xmlns:pic="http://schemas.openxmlformats.org/drawingml/2006/picture" xmlns:c="http://schemas.openxmlformats.org/drawingml/2006/chart" xmlns:lc="http://schemas.openxmlformats.org/drawingml/2006/lockedCanvas" xmlns:dgm="http://schemas.openxmlformats.org/drawingml/2006/diagram" xmlns:wps="http://schemas.microsoft.com/office/word/2010/wordprocessingShape" xmlns:wpg="http://schemas.microsoft.com/office/word/2010/wordprocessingGroup" xmlns:w14="http://schemas.microsoft.com/office/word/2010/wordml" xmlns:w15="http://schemas.microsoft.com/office/word/2012/wordml">
+<w:hdr xmlns:mc="http://schemas.openxmlformats.org/markup-compatibility/2006" xmlns:o="urn:schemas-microsoft-com:office:office" xmlns:r="http://schemas.openxmlformats.org/officeDocument/2006/relationships" xmlns:m="http://schemas.openxmlformats.org/officeDocument/2006/math" xmlns:v="urn:schemas-microsoft-com:vml" xmlns:wp="http://schemas.openxmlformats.org/drawingml/2006/wordprocessingDrawing" xmlns:w10="urn:schemas-microsoft-com:office:word" xmlns:w="http://schemas.openxmlformats.org/wordprocessingml/2006/main" xmlns:wne="http://schemas.microsoft.com/office/word/2006/wordml" xmlns:sl="http://schemas.openxmlformats.org/schemaLibrary/2006/main" xmlns:a="http://schemas.openxmlformats.org/drawingml/2006/main" xmlns:pic="http://schemas.openxmlformats.org/drawingml/2006/picture" xmlns:c="http://schemas.openxmlformats.org/drawingml/2006/chart" xmlns:lc="http://schemas.openxmlformats.org/drawingml/2006/lockedCanvas" xmlns:dgm="http://schemas.openxmlformats.org/drawingml/2006/diagram" xmlns:wps="http://schemas.microsoft.com/office/word/2010/wordprocessingShape" xmlns:wpg="http://schemas.microsoft.com/office/word/2010/wordprocessingGroup" xmlns:w14="http://schemas.microsoft.com/office/word/2010/wordml" xmlns:w15="http://schemas.microsoft.com/office/word/2012/wordml" xmlns:w16="http://schemas.microsoft.com/office/word/2018/wordml" xmlns:w16cex="http://schemas.microsoft.com/office/word/2018/wordml/cex" xmlns:w16cid="http://schemas.microsoft.com/office/word/2016/wordml/cid" xmlns="http://schemas.microsoft.com/office/tasks/2019/documenttasks" xmlns:cr="http://schemas.microsoft.com/office/comments/2020/reactions">
   <w:p>
     <w:pPr>
       <w:pStyle w:val="Title"/>
@@ -1471,14 +1744,16 @@
       <w:rPr>
         <w:rFonts w:ascii="Calibri" w:cs="Calibri" w:eastAsia="Calibri" w:hAnsi="Calibri"/>
         <w:b w:val="1"/>
+        <w:bCs w:val="1"/>
       </w:rPr>
     </w:pPr>
-    <w:bookmarkStart w:colFirst="0" w:colLast="0" w:name="_5rf9wr4r3no2" w:id="18"/>
-    <w:bookmarkEnd w:id="18"/>
+    <w:bookmarkStart w:colFirst="0" w:colLast="0" w:name="_5rf9wr4r3no2" w:id="24"/>
+    <w:bookmarkEnd w:id="24"/>
     <w:r>
       <w:rPr>
         <w:rFonts w:ascii="Calibri" w:cs="Calibri" w:eastAsia="Calibri" w:hAnsi="Calibri"/>
         <w:b w:val="1"/>
+        <w:bCs w:val="1"/>
         <w:rtl w:val="0"/>
       </w:rPr>
       <w:t xml:space="preserve">Samantha Hughes</w:t>
@@ -1511,7 +1786,7 @@
 </file>
 
 <file path=word/numbering.xml><?xml version="1.0" encoding="utf-8"?>
-<w:numbering xmlns:mc="http://schemas.openxmlformats.org/markup-compatibility/2006" xmlns:o="urn:schemas-microsoft-com:office:office" xmlns:r="http://schemas.openxmlformats.org/officeDocument/2006/relationships" xmlns:m="http://schemas.openxmlformats.org/officeDocument/2006/math" xmlns:v="urn:schemas-microsoft-com:vml" xmlns:wp="http://schemas.openxmlformats.org/drawingml/2006/wordprocessingDrawing" xmlns:w10="urn:schemas-microsoft-com:office:word" xmlns:w="http://schemas.openxmlformats.org/wordprocessingml/2006/main" xmlns:wne="http://schemas.microsoft.com/office/word/2006/wordml" xmlns:sl="http://schemas.openxmlformats.org/schemaLibrary/2006/main" xmlns:a="http://schemas.openxmlformats.org/drawingml/2006/main" xmlns:pic="http://schemas.openxmlformats.org/drawingml/2006/picture" xmlns:c="http://schemas.openxmlformats.org/drawingml/2006/chart" xmlns:lc="http://schemas.openxmlformats.org/drawingml/2006/lockedCanvas" xmlns:dgm="http://schemas.openxmlformats.org/drawingml/2006/diagram" xmlns:wps="http://schemas.microsoft.com/office/word/2010/wordprocessingShape" xmlns:wpg="http://schemas.microsoft.com/office/word/2010/wordprocessingGroup" xmlns:w14="http://schemas.microsoft.com/office/word/2010/wordml" xmlns:w15="http://schemas.microsoft.com/office/word/2012/wordml">
+<w:numbering xmlns:mc="http://schemas.openxmlformats.org/markup-compatibility/2006" xmlns:o="urn:schemas-microsoft-com:office:office" xmlns:r="http://schemas.openxmlformats.org/officeDocument/2006/relationships" xmlns:m="http://schemas.openxmlformats.org/officeDocument/2006/math" xmlns:v="urn:schemas-microsoft-com:vml" xmlns:wp="http://schemas.openxmlformats.org/drawingml/2006/wordprocessingDrawing" xmlns:w10="urn:schemas-microsoft-com:office:word" xmlns:w="http://schemas.openxmlformats.org/wordprocessingml/2006/main" xmlns:wne="http://schemas.microsoft.com/office/word/2006/wordml" xmlns:sl="http://schemas.openxmlformats.org/schemaLibrary/2006/main" xmlns:a="http://schemas.openxmlformats.org/drawingml/2006/main" xmlns:pic="http://schemas.openxmlformats.org/drawingml/2006/picture" xmlns:c="http://schemas.openxmlformats.org/drawingml/2006/chart" xmlns:lc="http://schemas.openxmlformats.org/drawingml/2006/lockedCanvas" xmlns:dgm="http://schemas.openxmlformats.org/drawingml/2006/diagram" xmlns:wps="http://schemas.microsoft.com/office/word/2010/wordprocessingShape" xmlns:wpg="http://schemas.microsoft.com/office/word/2010/wordprocessingGroup" xmlns:w14="http://schemas.microsoft.com/office/word/2010/wordml" xmlns:w15="http://schemas.microsoft.com/office/word/2012/wordml" xmlns:w16="http://schemas.microsoft.com/office/word/2018/wordml" xmlns:w16cex="http://schemas.microsoft.com/office/word/2018/wordml/cex" xmlns:w16cid="http://schemas.microsoft.com/office/word/2016/wordml/cid" xmlns="http://schemas.microsoft.com/office/tasks/2019/documenttasks" xmlns:cr="http://schemas.microsoft.com/office/comments/2020/reactions">
   <w:abstractNum w:abstractNumId="1">
     <w:lvl w:ilvl="0">
       <w:start w:val="1"/>
@@ -1968,7 +2243,7 @@
 </file>
 
 <file path=word/styles.xml><?xml version="1.0" encoding="utf-8"?>
-<w:styles xmlns:mc="http://schemas.openxmlformats.org/markup-compatibility/2006" xmlns:o="urn:schemas-microsoft-com:office:office" xmlns:r="http://schemas.openxmlformats.org/officeDocument/2006/relationships" xmlns:m="http://schemas.openxmlformats.org/officeDocument/2006/math" xmlns:v="urn:schemas-microsoft-com:vml" xmlns:wp="http://schemas.openxmlformats.org/drawingml/2006/wordprocessingDrawing" xmlns:w10="urn:schemas-microsoft-com:office:word" xmlns:w="http://schemas.openxmlformats.org/wordprocessingml/2006/main" xmlns:wne="http://schemas.microsoft.com/office/word/2006/wordml" xmlns:sl="http://schemas.openxmlformats.org/schemaLibrary/2006/main" xmlns:a="http://schemas.openxmlformats.org/drawingml/2006/main" xmlns:pic="http://schemas.openxmlformats.org/drawingml/2006/picture" xmlns:c="http://schemas.openxmlformats.org/drawingml/2006/chart" xmlns:lc="http://schemas.openxmlformats.org/drawingml/2006/lockedCanvas" xmlns:dgm="http://schemas.openxmlformats.org/drawingml/2006/diagram" xmlns:wps="http://schemas.microsoft.com/office/word/2010/wordprocessingShape" xmlns:wpg="http://schemas.microsoft.com/office/word/2010/wordprocessingGroup" xmlns:w14="http://schemas.microsoft.com/office/word/2010/wordml" xmlns:w15="http://schemas.microsoft.com/office/word/2012/wordml">
+<w:styles xmlns:mc="http://schemas.openxmlformats.org/markup-compatibility/2006" xmlns:o="urn:schemas-microsoft-com:office:office" xmlns:r="http://schemas.openxmlformats.org/officeDocument/2006/relationships" xmlns:m="http://schemas.openxmlformats.org/officeDocument/2006/math" xmlns:v="urn:schemas-microsoft-com:vml" xmlns:wp="http://schemas.openxmlformats.org/drawingml/2006/wordprocessingDrawing" xmlns:w10="urn:schemas-microsoft-com:office:word" xmlns:w="http://schemas.openxmlformats.org/wordprocessingml/2006/main" xmlns:wne="http://schemas.microsoft.com/office/word/2006/wordml" xmlns:sl="http://schemas.openxmlformats.org/schemaLibrary/2006/main" xmlns:a="http://schemas.openxmlformats.org/drawingml/2006/main" xmlns:pic="http://schemas.openxmlformats.org/drawingml/2006/picture" xmlns:c="http://schemas.openxmlformats.org/drawingml/2006/chart" xmlns:lc="http://schemas.openxmlformats.org/drawingml/2006/lockedCanvas" xmlns:dgm="http://schemas.openxmlformats.org/drawingml/2006/diagram" xmlns:wps="http://schemas.microsoft.com/office/word/2010/wordprocessingShape" xmlns:wpg="http://schemas.microsoft.com/office/word/2010/wordprocessingGroup" xmlns:w14="http://schemas.microsoft.com/office/word/2010/wordml" xmlns:w15="http://schemas.microsoft.com/office/word/2012/wordml" xmlns:w16="http://schemas.microsoft.com/office/word/2018/wordml" xmlns:w16cex="http://schemas.microsoft.com/office/word/2018/wordml/cex" xmlns:w16cid="http://schemas.microsoft.com/office/word/2016/wordml/cid" xmlns="http://schemas.microsoft.com/office/tasks/2019/documenttasks" xmlns:cr="http://schemas.microsoft.com/office/comments/2020/reactions">
   <w:docDefaults>
     <w:rPrDefault>
       <w:rPr>
@@ -1982,11 +2257,19 @@
       </w:pPr>
     </w:pPrDefault>
   </w:docDefaults>
+  <w:style w:type="table" w:styleId="TableNormal" w:default="1">
+    <w:name w:val="TableNormal"/>
+    <w:tblPr>
+      <w:tblCellMar>
+        <w:top w:w="100.0" w:type="dxa"/>
+        <w:left w:w="100.0" w:type="dxa"/>
+        <w:bottom w:w="100.0" w:type="dxa"/>
+        <w:right w:w="100.0" w:type="dxa"/>
+      </w:tblCellMar>
+    </w:tblPr>
+  </w:style>
   <w:style w:type="paragraph" w:styleId="Normal" w:default="1">
     <w:name w:val="normal"/>
-  </w:style>
-  <w:style w:type="table" w:styleId="TableNormal" w:default="1">
-    <w:name w:val="Table Normal"/>
   </w:style>
   <w:style w:type="paragraph" w:styleId="Heading1">
     <w:name w:val="heading 1"/>
@@ -2002,6 +2285,7 @@
     <w:rPr>
       <w:rFonts w:ascii="Calibri" w:cs="Calibri" w:eastAsia="Calibri" w:hAnsi="Calibri"/>
       <w:b w:val="1"/>
+      <w:bCs w:val="1"/>
       <w:sz w:val="32"/>
       <w:szCs w:val="32"/>
     </w:rPr>
@@ -2083,6 +2367,7 @@
     <w:rPr>
       <w:rFonts w:ascii="Trebuchet MS" w:cs="Trebuchet MS" w:eastAsia="Trebuchet MS" w:hAnsi="Trebuchet MS"/>
       <w:i w:val="1"/>
+      <w:iCs w:val="1"/>
       <w:color w:val="666666"/>
       <w:sz w:val="22"/>
       <w:szCs w:val="22"/>
@@ -2115,6 +2400,11 @@
       <w:sz w:val="24"/>
       <w:szCs w:val="24"/>
     </w:rPr>
+  </w:style>
+  <w:style w:type="paragraph" w:styleId="TableofFigures">
+    <w:name w:val="table of figures"/>
+    <w:basedOn w:val="Normal"/>
+    <w:next w:val="Normal"/>
   </w:style>
 </w:styles>
 </file>

</xml_diff>

<commit_message>
resume: add 2024-2026 roles, fix dates, add markdown version (#41)
* resume: anaconda full-time start is apr 2017, per signed offer

Co-Authored-By: Claude Opus 5.5 <noreply@anthropic.com>

* resume: add sync, capital one, earthmover; markdown copy for ai readers

Re-exported pdf/docx from the google doc. Coiled ends may 2024, page break
moved so the team lead role does not split.

Co-Authored-By: Claude Opus 5.5 <noreply@anthropic.com>

---------

Co-authored-by: Samantha Hughes <samantha@earthmover.io>
Co-authored-by: Claude Opus 5.5 <noreply@anthropic.com>
</commit_message>
<xml_diff>
--- a/frontend/public/Samantha_Hughes_Resume.docx
+++ b/frontend/public/Samantha_Hughes_Resume.docx
@@ -1,6 +1,6 @@
 
 <file path=word/document.xml><?xml version="1.0" encoding="utf-8"?>
-<w:document xmlns:mc="http://schemas.openxmlformats.org/markup-compatibility/2006" xmlns:o="urn:schemas-microsoft-com:office:office" xmlns:r="http://schemas.openxmlformats.org/officeDocument/2006/relationships" xmlns:m="http://schemas.openxmlformats.org/officeDocument/2006/math" xmlns:v="urn:schemas-microsoft-com:vml" xmlns:wp="http://schemas.openxmlformats.org/drawingml/2006/wordprocessingDrawing" xmlns:w10="urn:schemas-microsoft-com:office:word" xmlns:w="http://schemas.openxmlformats.org/wordprocessingml/2006/main" xmlns:wne="http://schemas.microsoft.com/office/word/2006/wordml" xmlns:sl="http://schemas.openxmlformats.org/schemaLibrary/2006/main" xmlns:a="http://schemas.openxmlformats.org/drawingml/2006/main" xmlns:pic="http://schemas.openxmlformats.org/drawingml/2006/picture" xmlns:c="http://schemas.openxmlformats.org/drawingml/2006/chart" xmlns:lc="http://schemas.openxmlformats.org/drawingml/2006/lockedCanvas" xmlns:dgm="http://schemas.openxmlformats.org/drawingml/2006/diagram" xmlns:wps="http://schemas.microsoft.com/office/word/2010/wordprocessingShape" xmlns:wpg="http://schemas.microsoft.com/office/word/2010/wordprocessingGroup" xmlns:w14="http://schemas.microsoft.com/office/word/2010/wordml" xmlns:w15="http://schemas.microsoft.com/office/word/2012/wordml">
+<w:document xmlns:mc="http://schemas.openxmlformats.org/markup-compatibility/2006" xmlns:o="urn:schemas-microsoft-com:office:office" xmlns:r="http://schemas.openxmlformats.org/officeDocument/2006/relationships" xmlns:m="http://schemas.openxmlformats.org/officeDocument/2006/math" xmlns:v="urn:schemas-microsoft-com:vml" xmlns:wp="http://schemas.openxmlformats.org/drawingml/2006/wordprocessingDrawing" xmlns:w10="urn:schemas-microsoft-com:office:word" xmlns:w="http://schemas.openxmlformats.org/wordprocessingml/2006/main" xmlns:wne="http://schemas.microsoft.com/office/word/2006/wordml" xmlns:sl="http://schemas.openxmlformats.org/schemaLibrary/2006/main" xmlns:a="http://schemas.openxmlformats.org/drawingml/2006/main" xmlns:pic="http://schemas.openxmlformats.org/drawingml/2006/picture" xmlns:c="http://schemas.openxmlformats.org/drawingml/2006/chart" xmlns:lc="http://schemas.openxmlformats.org/drawingml/2006/lockedCanvas" xmlns:dgm="http://schemas.openxmlformats.org/drawingml/2006/diagram" xmlns:wps="http://schemas.microsoft.com/office/word/2010/wordprocessingShape" xmlns:wpg="http://schemas.microsoft.com/office/word/2010/wordprocessingGroup" xmlns:w14="http://schemas.microsoft.com/office/word/2010/wordml" xmlns:w15="http://schemas.microsoft.com/office/word/2012/wordml" xmlns:w16="http://schemas.microsoft.com/office/word/2018/wordml" xmlns:w16cex="http://schemas.microsoft.com/office/word/2018/wordml/cex" xmlns:w16cid="http://schemas.microsoft.com/office/word/2016/wordml/cid" xmlns="http://schemas.microsoft.com/office/tasks/2019/documenttasks" xmlns:cr="http://schemas.microsoft.com/office/comments/2020/reactions">
   <w:body>
     <w:p>
       <w:pPr>
@@ -218,25 +218,13 @@
           <w:szCs w:val="24"/>
         </w:rPr>
       </w:pPr>
-      <w:bookmarkStart w:colFirst="0" w:colLast="0" w:name="_pb6klwujmetx" w:id="5"/>
+      <w:bookmarkStart w:colFirst="0" w:colLast="0" w:name="_4y025hr4fv3z" w:id="5"/>
       <w:bookmarkEnd w:id="5"/>
       <w:r>
         <w:rPr>
           <w:rtl w:val="0"/>
         </w:rPr>
-        <w:t xml:space="preserve">May 2022 </w:t>
-      </w:r>
-      <w:r>
-        <w:rPr>
-          <w:rtl w:val="0"/>
-        </w:rPr>
-        <w:t xml:space="preserve">-&gt;</w:t>
-      </w:r>
-      <w:r>
-        <w:rPr>
-          <w:rtl w:val="0"/>
-        </w:rPr>
-        <w:t xml:space="preserve"> Present</w:t>
+        <w:t xml:space="preserve">Sep 2025 -&gt; Present</w:t>
       </w:r>
       <w:r>
         <w:rPr>
@@ -248,17 +236,273 @@
       <w:pPr>
         <w:pStyle w:val="Heading3"/>
         <w:rPr>
+          <w:i w:val="1"/>
+          <w:iCs w:val="1"/>
+        </w:rPr>
+      </w:pPr>
+      <w:bookmarkStart w:colFirst="0" w:colLast="0" w:name="_cxg8a9wbkhre" w:id="6"/>
+      <w:bookmarkEnd w:id="6"/>
+      <w:r>
+        <w:rPr>
+          <w:b w:val="1"/>
+          <w:bCs w:val="1"/>
+          <w:rtl w:val="0"/>
+        </w:rPr>
+        <w:t xml:space="preserve">Earthmover</w:t>
+      </w:r>
+      <w:r>
+        <w:rPr>
+          <w:rtl w:val="0"/>
+        </w:rPr>
+        <w:t xml:space="preserve"> - </w:t>
+      </w:r>
+      <w:r>
+        <w:rPr>
+          <w:i w:val="1"/>
+          <w:iCs w:val="1"/>
+          <w:rtl w:val="0"/>
+        </w:rPr>
+        <w:t xml:space="preserve">Staff Software Engineer</w:t>
+      </w:r>
+      <w:r>
+        <w:rPr>
+          <w:rtl w:val="0"/>
+        </w:rPr>
+      </w:r>
+    </w:p>
+    <w:p>
+      <w:pPr>
+        <w:numPr>
+          <w:ilvl w:val="0"/>
+          <w:numId w:val="3"/>
+        </w:numPr>
+        <w:ind w:left="720" w:hanging="360"/>
+        <w:rPr>
+          <w:sz w:val="20"/>
+          <w:szCs w:val="20"/>
+        </w:rPr>
+      </w:pPr>
+      <w:r>
+        <w:rPr>
+          <w:rFonts w:ascii="Calibri" w:cs="Calibri" w:eastAsia="Calibri" w:hAnsi="Calibri"/>
+          <w:color w:val="434343"/>
+          <w:rtl w:val="0"/>
+        </w:rPr>
+        <w:t xml:space="preserve">Designed and built the customer compute control plane and the job platform for Arraylake, ran the ECS-to-EKS and MongoDB-to-Postgres migrations, and led a cost program that cut the AWS run rate about 45%.</w:t>
+      </w:r>
+      <w:r>
+        <w:rPr>
+          <w:rtl w:val="0"/>
+        </w:rPr>
+      </w:r>
+    </w:p>
+    <w:p>
+      <w:pPr>
+        <w:pStyle w:val="Heading3"/>
+        <w:rPr>
+          <w:sz w:val="24"/>
+          <w:szCs w:val="24"/>
+        </w:rPr>
+      </w:pPr>
+      <w:bookmarkStart w:colFirst="0" w:colLast="0" w:name="_y9pfyyiej69z" w:id="7"/>
+      <w:bookmarkEnd w:id="7"/>
+      <w:r>
+        <w:rPr>
+          <w:rtl w:val="0"/>
+        </w:rPr>
+        <w:t xml:space="preserve">Mar 2025 -&gt; Sep 2025</w:t>
+      </w:r>
+      <w:r>
+        <w:rPr>
+          <w:rtl w:val="0"/>
+        </w:rPr>
+      </w:r>
+    </w:p>
+    <w:p>
+      <w:pPr>
+        <w:pStyle w:val="Heading3"/>
+        <w:rPr>
+          <w:i w:val="1"/>
+          <w:iCs w:val="1"/>
+        </w:rPr>
+      </w:pPr>
+      <w:bookmarkStart w:colFirst="0" w:colLast="0" w:name="_i5h8toqa8she" w:id="8"/>
+      <w:bookmarkEnd w:id="8"/>
+      <w:r>
+        <w:rPr>
+          <w:b w:val="1"/>
+          <w:bCs w:val="1"/>
+          <w:rtl w:val="0"/>
+        </w:rPr>
+        <w:t xml:space="preserve">Capital One</w:t>
+      </w:r>
+      <w:r>
+        <w:rPr>
+          <w:rtl w:val="0"/>
+        </w:rPr>
+        <w:t xml:space="preserve"> - </w:t>
+      </w:r>
+      <w:r>
+        <w:rPr>
+          <w:i w:val="1"/>
+          <w:iCs w:val="1"/>
+          <w:rtl w:val="0"/>
+        </w:rPr>
+        <w:t xml:space="preserve">Senior Lead Software Engineer</w:t>
+      </w:r>
+    </w:p>
+    <w:p>
+      <w:pPr>
+        <w:numPr>
+          <w:ilvl w:val="0"/>
+          <w:numId w:val="3"/>
+        </w:numPr>
+        <w:ind w:left="720" w:hanging="360"/>
+        <w:rPr>
+          <w:sz w:val="20"/>
+          <w:szCs w:val="20"/>
+        </w:rPr>
+      </w:pPr>
+      <w:r>
+        <w:rPr>
+          <w:rFonts w:ascii="Calibri" w:cs="Calibri" w:eastAsia="Calibri" w:hAnsi="Calibri"/>
+          <w:color w:val="434343"/>
+          <w:rtl w:val="0"/>
+        </w:rPr>
+        <w:t xml:space="preserve">After the acquisition, led the rebuild of Sync Computing’s Databricks cost-optimization platform as Capital One’s Slingshot, shipped for the Databricks AI Summit.</w:t>
+      </w:r>
+      <w:r>
+        <w:rPr>
+          <w:rtl w:val="0"/>
+        </w:rPr>
+      </w:r>
+    </w:p>
+    <w:p>
+      <w:pPr>
+        <w:pStyle w:val="Heading3"/>
+        <w:rPr>
+          <w:sz w:val="24"/>
+          <w:szCs w:val="24"/>
+        </w:rPr>
+      </w:pPr>
+      <w:bookmarkStart w:colFirst="0" w:colLast="0" w:name="_spaj35yqu371" w:id="9"/>
+      <w:bookmarkEnd w:id="9"/>
+      <w:r>
+        <w:rPr>
+          <w:rtl w:val="0"/>
+        </w:rPr>
+        <w:t xml:space="preserve">Jun 2024 -&gt; Mar 2025</w:t>
+      </w:r>
+      <w:r>
+        <w:rPr>
+          <w:rtl w:val="0"/>
+        </w:rPr>
+      </w:r>
+    </w:p>
+    <w:p>
+      <w:pPr>
+        <w:pStyle w:val="Heading3"/>
+        <w:rPr>
+          <w:i w:val="1"/>
+          <w:iCs w:val="1"/>
+        </w:rPr>
+      </w:pPr>
+      <w:bookmarkStart w:colFirst="0" w:colLast="0" w:name="_g67fgf2d6wx" w:id="10"/>
+      <w:bookmarkEnd w:id="10"/>
+      <w:r>
+        <w:rPr>
+          <w:b w:val="1"/>
+          <w:bCs w:val="1"/>
+          <w:rtl w:val="0"/>
+        </w:rPr>
+        <w:t xml:space="preserve">Sync Computing</w:t>
+      </w:r>
+      <w:r>
+        <w:rPr>
+          <w:rtl w:val="0"/>
+        </w:rPr>
+        <w:t xml:space="preserve"> - </w:t>
+      </w:r>
+      <w:r>
+        <w:rPr>
+          <w:i w:val="1"/>
+          <w:iCs w:val="1"/>
+          <w:rtl w:val="0"/>
+        </w:rPr>
+        <w:t xml:space="preserve">Staff Software Engineer</w:t>
+      </w:r>
+      <w:r>
+        <w:rPr>
+          <w:rtl w:val="0"/>
+        </w:rPr>
+      </w:r>
+    </w:p>
+    <w:p>
+      <w:pPr>
+        <w:numPr>
+          <w:ilvl w:val="0"/>
+          <w:numId w:val="3"/>
+        </w:numPr>
+        <w:ind w:left="720" w:hanging="360"/>
+        <w:rPr>
+          <w:sz w:val="20"/>
+          <w:szCs w:val="20"/>
+        </w:rPr>
+      </w:pPr>
+      <w:r>
+        <w:rPr>
+          <w:rFonts w:ascii="Calibri" w:cs="Calibri" w:eastAsia="Calibri" w:hAnsi="Calibri"/>
+          <w:color w:val="434343"/>
+          <w:rtl w:val="0"/>
+        </w:rPr>
+        <w:t xml:space="preserve">Rebuilt the monitoring and infrastructure stack for enterprise-scale workloads, which unblocked a large enterprise onboarding and readied the product for acquisition by Capital One.</w:t>
+      </w:r>
+      <w:r>
+        <w:rPr>
+          <w:rtl w:val="0"/>
+        </w:rPr>
+      </w:r>
+    </w:p>
+    <w:p>
+      <w:pPr>
+        <w:pStyle w:val="Heading3"/>
+        <w:rPr>
+          <w:sz w:val="24"/>
+          <w:szCs w:val="24"/>
+        </w:rPr>
+      </w:pPr>
+      <w:bookmarkStart w:colFirst="0" w:colLast="0" w:name="_pb6klwujmetx" w:id="11"/>
+      <w:bookmarkEnd w:id="11"/>
+      <w:r>
+        <w:rPr>
+          <w:rtl w:val="0"/>
+        </w:rPr>
+        <w:t xml:space="preserve">May 2022 -&gt; May 2024</w:t>
+      </w:r>
+      <w:r>
+        <w:rPr>
+          <w:rtl w:val="0"/>
+        </w:rPr>
+      </w:r>
+    </w:p>
+    <w:p>
+      <w:pPr>
+        <w:pStyle w:val="Heading3"/>
+        <w:rPr>
           <w:rFonts w:ascii="Calibri" w:cs="Calibri" w:eastAsia="Calibri" w:hAnsi="Calibri"/>
           <w:b w:val="0"/>
+          <w:bCs w:val="0"/>
           <w:i w:val="1"/>
-          <w:color w:val="434343"/>
-        </w:rPr>
-      </w:pPr>
-      <w:bookmarkStart w:colFirst="0" w:colLast="0" w:name="_mofu6vopi18q" w:id="6"/>
-      <w:bookmarkEnd w:id="6"/>
+          <w:iCs w:val="1"/>
+          <w:color w:val="434343"/>
+        </w:rPr>
+      </w:pPr>
+      <w:bookmarkStart w:colFirst="0" w:colLast="0" w:name="_mofu6vopi18q" w:id="12"/>
+      <w:bookmarkEnd w:id="12"/>
       <w:r>
         <w:rPr>
           <w:b w:val="1"/>
+          <w:bCs w:val="1"/>
           <w:color w:val="434343"/>
           <w:rtl w:val="0"/>
         </w:rPr>
@@ -276,6 +520,7 @@
         <w:rPr>
           <w:rFonts w:ascii="Calibri" w:cs="Calibri" w:eastAsia="Calibri" w:hAnsi="Calibri"/>
           <w:b w:val="0"/>
+          <w:bCs w:val="0"/>
           <w:color w:val="434343"/>
           <w:rtl w:val="0"/>
         </w:rPr>
@@ -293,7 +538,9 @@
         <w:rPr>
           <w:rFonts w:ascii="Calibri" w:cs="Calibri" w:eastAsia="Calibri" w:hAnsi="Calibri"/>
           <w:b w:val="0"/>
+          <w:bCs w:val="0"/>
           <w:i w:val="1"/>
+          <w:iCs w:val="1"/>
           <w:color w:val="434343"/>
           <w:rtl w:val="0"/>
         </w:rPr>
@@ -509,8 +756,25 @@
         <w:spacing w:before="0" w:line="240" w:lineRule="auto"/>
         <w:rPr/>
       </w:pPr>
-      <w:bookmarkStart w:colFirst="0" w:colLast="0" w:name="_i6o0sra49zfi" w:id="7"/>
-      <w:bookmarkEnd w:id="7"/>
+      <w:bookmarkStart w:colFirst="0" w:colLast="0" w:name="_uqbkj5enxzec" w:id="13"/>
+      <w:bookmarkEnd w:id="13"/>
+      <w:r>
+        <w:br w:type="page"/>
+      </w:r>
+      <w:r>
+        <w:rPr>
+          <w:rtl w:val="0"/>
+        </w:rPr>
+      </w:r>
+    </w:p>
+    <w:p>
+      <w:pPr>
+        <w:pStyle w:val="Heading3"/>
+        <w:spacing w:before="0" w:line="240" w:lineRule="auto"/>
+        <w:rPr/>
+      </w:pPr>
+      <w:bookmarkStart w:colFirst="0" w:colLast="0" w:name="_i6o0sra49zfi" w:id="14"/>
+      <w:bookmarkEnd w:id="14"/>
       <w:r>
         <w:rPr>
           <w:rtl w:val="0"/>
@@ -524,6 +788,7 @@
         <w:rPr>
           <w:rFonts w:ascii="Calibri" w:cs="Calibri" w:eastAsia="Calibri" w:hAnsi="Calibri"/>
           <w:i w:val="1"/>
+          <w:iCs w:val="1"/>
           <w:color w:val="434343"/>
           <w:sz w:val="22"/>
           <w:szCs w:val="22"/>
@@ -533,6 +798,7 @@
         <w:rPr>
           <w:rFonts w:ascii="Calibri" w:cs="Calibri" w:eastAsia="Calibri" w:hAnsi="Calibri"/>
           <w:b w:val="1"/>
+          <w:bCs w:val="1"/>
           <w:color w:val="434343"/>
           <w:sz w:val="22"/>
           <w:szCs w:val="22"/>
@@ -554,6 +820,7 @@
         <w:rPr>
           <w:rFonts w:ascii="Calibri" w:cs="Calibri" w:eastAsia="Calibri" w:hAnsi="Calibri"/>
           <w:i w:val="1"/>
+          <w:iCs w:val="1"/>
           <w:color w:val="434343"/>
           <w:sz w:val="22"/>
           <w:szCs w:val="22"/>
@@ -617,8 +884,8 @@
         <w:spacing w:line="240" w:lineRule="auto"/>
         <w:rPr/>
       </w:pPr>
-      <w:bookmarkStart w:colFirst="0" w:colLast="0" w:name="_wswn86fbay28" w:id="8"/>
-      <w:bookmarkEnd w:id="8"/>
+      <w:bookmarkStart w:colFirst="0" w:colLast="0" w:name="_wswn86fbay28" w:id="15"/>
+      <w:bookmarkEnd w:id="15"/>
       <w:r>
         <w:rPr>
           <w:rtl w:val="0"/>
@@ -633,6 +900,7 @@
         <w:rPr>
           <w:rFonts w:ascii="Calibri" w:cs="Calibri" w:eastAsia="Calibri" w:hAnsi="Calibri"/>
           <w:i w:val="1"/>
+          <w:iCs w:val="1"/>
           <w:color w:val="434343"/>
           <w:sz w:val="22"/>
           <w:szCs w:val="22"/>
@@ -642,6 +910,7 @@
         <w:rPr>
           <w:rFonts w:ascii="Calibri" w:cs="Calibri" w:eastAsia="Calibri" w:hAnsi="Calibri"/>
           <w:b w:val="1"/>
+          <w:bCs w:val="1"/>
           <w:color w:val="434343"/>
           <w:sz w:val="22"/>
           <w:szCs w:val="22"/>
@@ -653,6 +922,7 @@
         <w:rPr>
           <w:rFonts w:ascii="Calibri" w:cs="Calibri" w:eastAsia="Calibri" w:hAnsi="Calibri"/>
           <w:i w:val="1"/>
+          <w:iCs w:val="1"/>
           <w:color w:val="434343"/>
           <w:sz w:val="22"/>
           <w:szCs w:val="22"/>
@@ -764,39 +1034,11 @@
     </w:p>
     <w:p>
       <w:pPr>
-        <w:pStyle w:val="Heading2"/>
-        <w:pageBreakBefore w:val="0"/>
-        <w:pBdr>
-          <w:top w:space="0" w:sz="0" w:val="nil"/>
-          <w:left w:space="0" w:sz="0" w:val="nil"/>
-          <w:bottom w:space="0" w:sz="0" w:val="nil"/>
-          <w:right w:space="0" w:sz="0" w:val="nil"/>
-          <w:between w:space="0" w:sz="0" w:val="nil"/>
-        </w:pBdr>
-        <w:shd w:fill="auto" w:val="clear"/>
-        <w:rPr>
-          <w:rFonts w:ascii="Calibri" w:cs="Calibri" w:eastAsia="Calibri" w:hAnsi="Calibri"/>
-          <w:color w:val="434343"/>
-        </w:rPr>
-      </w:pPr>
-      <w:bookmarkStart w:colFirst="0" w:colLast="0" w:name="_kdo1727fhasy" w:id="9"/>
-      <w:bookmarkEnd w:id="9"/>
-      <w:r>
-        <w:br w:type="page"/>
-      </w:r>
-      <w:r>
-        <w:rPr>
-          <w:rtl w:val="0"/>
-        </w:rPr>
-      </w:r>
-    </w:p>
-    <w:p>
-      <w:pPr>
         <w:pStyle w:val="Heading3"/>
         <w:rPr/>
       </w:pPr>
-      <w:bookmarkStart w:colFirst="0" w:colLast="0" w:name="_9hamueqzod31" w:id="10"/>
-      <w:bookmarkEnd w:id="10"/>
+      <w:bookmarkStart w:colFirst="0" w:colLast="0" w:name="_9hamueqzod31" w:id="16"/>
+      <w:bookmarkEnd w:id="16"/>
       <w:r>
         <w:rPr>
           <w:rtl w:val="0"/>
@@ -824,15 +1066,18 @@
         <w:rPr>
           <w:rFonts w:ascii="Calibri" w:cs="Calibri" w:eastAsia="Calibri" w:hAnsi="Calibri"/>
           <w:b w:val="0"/>
+          <w:bCs w:val="0"/>
           <w:i w:val="1"/>
-          <w:color w:val="434343"/>
-        </w:rPr>
-      </w:pPr>
-      <w:bookmarkStart w:colFirst="0" w:colLast="0" w:name="_klvjjwvj40i3" w:id="11"/>
-      <w:bookmarkEnd w:id="11"/>
+          <w:iCs w:val="1"/>
+          <w:color w:val="434343"/>
+        </w:rPr>
+      </w:pPr>
+      <w:bookmarkStart w:colFirst="0" w:colLast="0" w:name="_klvjjwvj40i3" w:id="17"/>
+      <w:bookmarkEnd w:id="17"/>
       <w:r>
         <w:rPr>
           <w:b w:val="1"/>
+          <w:bCs w:val="1"/>
           <w:color w:val="434343"/>
           <w:rtl w:val="0"/>
         </w:rPr>
@@ -842,7 +1087,9 @@
         <w:rPr>
           <w:rFonts w:ascii="Calibri" w:cs="Calibri" w:eastAsia="Calibri" w:hAnsi="Calibri"/>
           <w:b w:val="0"/>
+          <w:bCs w:val="0"/>
           <w:i w:val="1"/>
+          <w:iCs w:val="1"/>
           <w:color w:val="434343"/>
           <w:rtl w:val="0"/>
         </w:rPr>
@@ -853,7 +1100,7 @@
       <w:pPr>
         <w:numPr>
           <w:ilvl w:val="0"/>
-          <w:numId w:val="4"/>
+          <w:numId w:val="2"/>
         </w:numPr>
         <w:spacing w:after="0" w:afterAutospacing="0" w:before="240" w:lineRule="auto"/>
         <w:ind w:left="720" w:hanging="360"/>
@@ -885,7 +1132,7 @@
       <w:pPr>
         <w:numPr>
           <w:ilvl w:val="0"/>
-          <w:numId w:val="4"/>
+          <w:numId w:val="2"/>
         </w:numPr>
         <w:spacing w:after="240" w:before="0" w:beforeAutospacing="0" w:lineRule="auto"/>
         <w:ind w:left="720" w:hanging="360"/>
@@ -918,13 +1165,13 @@
         <w:pStyle w:val="Heading3"/>
         <w:rPr/>
       </w:pPr>
-      <w:bookmarkStart w:colFirst="0" w:colLast="0" w:name="_8p24tzp33ejg" w:id="12"/>
-      <w:bookmarkEnd w:id="12"/>
-      <w:r>
-        <w:rPr>
-          <w:rtl w:val="0"/>
-        </w:rPr>
-        <w:t xml:space="preserve">Mar 2017 -&gt; Feb 2018</w:t>
+      <w:bookmarkStart w:colFirst="0" w:colLast="0" w:name="_8p24tzp33ejg" w:id="18"/>
+      <w:bookmarkEnd w:id="18"/>
+      <w:r>
+        <w:rPr>
+          <w:rtl w:val="0"/>
+        </w:rPr>
+        <w:t xml:space="preserve">Apr 2017 -&gt; Feb 2018</w:t>
       </w:r>
       <w:r>
         <w:rPr>
@@ -947,15 +1194,18 @@
         <w:rPr>
           <w:rFonts w:ascii="Calibri" w:cs="Calibri" w:eastAsia="Calibri" w:hAnsi="Calibri"/>
           <w:b w:val="0"/>
+          <w:bCs w:val="0"/>
           <w:i w:val="1"/>
-          <w:color w:val="434343"/>
-        </w:rPr>
-      </w:pPr>
-      <w:bookmarkStart w:colFirst="0" w:colLast="0" w:name="_2mwrupb75gpr" w:id="13"/>
-      <w:bookmarkEnd w:id="13"/>
+          <w:iCs w:val="1"/>
+          <w:color w:val="434343"/>
+        </w:rPr>
+      </w:pPr>
+      <w:bookmarkStart w:colFirst="0" w:colLast="0" w:name="_2mwrupb75gpr" w:id="19"/>
+      <w:bookmarkEnd w:id="19"/>
       <w:r>
         <w:rPr>
           <w:b w:val="1"/>
+          <w:bCs w:val="1"/>
           <w:color w:val="434343"/>
           <w:rtl w:val="0"/>
         </w:rPr>
@@ -965,7 +1215,9 @@
         <w:rPr>
           <w:rFonts w:ascii="Calibri" w:cs="Calibri" w:eastAsia="Calibri" w:hAnsi="Calibri"/>
           <w:b w:val="0"/>
+          <w:bCs w:val="0"/>
           <w:i w:val="1"/>
+          <w:iCs w:val="1"/>
           <w:color w:val="434343"/>
           <w:rtl w:val="0"/>
         </w:rPr>
@@ -976,7 +1228,7 @@
       <w:pPr>
         <w:numPr>
           <w:ilvl w:val="0"/>
-          <w:numId w:val="2"/>
+          <w:numId w:val="4"/>
         </w:numPr>
         <w:spacing w:after="0" w:afterAutospacing="0" w:before="240" w:lineRule="auto"/>
         <w:ind w:left="720" w:hanging="360"/>
@@ -1028,7 +1280,7 @@
       <w:pPr>
         <w:numPr>
           <w:ilvl w:val="0"/>
-          <w:numId w:val="2"/>
+          <w:numId w:val="4"/>
         </w:numPr>
         <w:spacing w:after="240" w:before="0" w:beforeAutospacing="0" w:lineRule="auto"/>
         <w:ind w:left="720" w:hanging="360"/>
@@ -1062,8 +1314,8 @@
           <w:color w:val="434343"/>
         </w:rPr>
       </w:pPr>
-      <w:bookmarkStart w:colFirst="0" w:colLast="0" w:name="_k97xo0qx7jdm" w:id="14"/>
-      <w:bookmarkEnd w:id="14"/>
+      <w:bookmarkStart w:colFirst="0" w:colLast="0" w:name="_k97xo0qx7jdm" w:id="20"/>
+      <w:bookmarkEnd w:id="20"/>
       <w:r>
         <w:rPr>
           <w:rFonts w:ascii="Calibri" w:cs="Calibri" w:eastAsia="Calibri" w:hAnsi="Calibri"/>
@@ -1083,8 +1335,8 @@
         <w:pStyle w:val="Heading3"/>
         <w:rPr/>
       </w:pPr>
-      <w:bookmarkStart w:colFirst="0" w:colLast="0" w:name="_v9j91n2fon3f" w:id="15"/>
-      <w:bookmarkEnd w:id="15"/>
+      <w:bookmarkStart w:colFirst="0" w:colLast="0" w:name="_v9j91n2fon3f" w:id="21"/>
+      <w:bookmarkEnd w:id="21"/>
       <w:commentRangeStart w:id="0"/>
       <w:commentRangeStart w:id="1"/>
       <w:commentRangeStart w:id="2"/>
@@ -1132,15 +1384,18 @@
         <w:rPr>
           <w:rFonts w:ascii="Calibri" w:cs="Calibri" w:eastAsia="Calibri" w:hAnsi="Calibri"/>
           <w:b w:val="0"/>
+          <w:bCs w:val="0"/>
           <w:i w:val="1"/>
-          <w:color w:val="434343"/>
-        </w:rPr>
-      </w:pPr>
-      <w:bookmarkStart w:colFirst="0" w:colLast="0" w:name="_78rlvk1sif5a" w:id="16"/>
-      <w:bookmarkEnd w:id="16"/>
+          <w:iCs w:val="1"/>
+          <w:color w:val="434343"/>
+        </w:rPr>
+      </w:pPr>
+      <w:bookmarkStart w:colFirst="0" w:colLast="0" w:name="_78rlvk1sif5a" w:id="22"/>
+      <w:bookmarkEnd w:id="22"/>
       <w:r>
         <w:rPr>
           <w:b w:val="1"/>
+          <w:bCs w:val="1"/>
           <w:color w:val="434343"/>
           <w:rtl w:val="0"/>
         </w:rPr>
@@ -1158,7 +1413,9 @@
         <w:rPr>
           <w:rFonts w:ascii="Calibri" w:cs="Calibri" w:eastAsia="Calibri" w:hAnsi="Calibri"/>
           <w:b w:val="0"/>
+          <w:bCs w:val="0"/>
           <w:i w:val="1"/>
+          <w:iCs w:val="1"/>
           <w:color w:val="434343"/>
           <w:rtl w:val="0"/>
         </w:rPr>
@@ -1183,8 +1440,8 @@
           <w:color w:val="434343"/>
         </w:rPr>
       </w:pPr>
-      <w:bookmarkStart w:colFirst="0" w:colLast="0" w:name="_txda8vxduhlz" w:id="17"/>
-      <w:bookmarkEnd w:id="17"/>
+      <w:bookmarkStart w:colFirst="0" w:colLast="0" w:name="_txda8vxduhlz" w:id="23"/>
+      <w:bookmarkEnd w:id="23"/>
       <w:r>
         <w:rPr>
           <w:rtl w:val="0"/>
@@ -1202,7 +1459,7 @@
 </file>
 
 <file path=word/comments.xml><?xml version="1.0" encoding="utf-8"?>
-<w:comments xmlns:mc="http://schemas.openxmlformats.org/markup-compatibility/2006" xmlns:o="urn:schemas-microsoft-com:office:office" xmlns:r="http://schemas.openxmlformats.org/officeDocument/2006/relationships" xmlns:m="http://schemas.openxmlformats.org/officeDocument/2006/math" xmlns:v="urn:schemas-microsoft-com:vml" xmlns:wp="http://schemas.openxmlformats.org/drawingml/2006/wordprocessingDrawing" xmlns:w10="urn:schemas-microsoft-com:office:word" xmlns:w="http://schemas.openxmlformats.org/wordprocessingml/2006/main" xmlns:wne="http://schemas.microsoft.com/office/word/2006/wordml" xmlns:sl="http://schemas.openxmlformats.org/schemaLibrary/2006/main" xmlns:a="http://schemas.openxmlformats.org/drawingml/2006/main" xmlns:pic="http://schemas.openxmlformats.org/drawingml/2006/picture" xmlns:c="http://schemas.openxmlformats.org/drawingml/2006/chart" xmlns:lc="http://schemas.openxmlformats.org/drawingml/2006/lockedCanvas" xmlns:dgm="http://schemas.openxmlformats.org/drawingml/2006/diagram" xmlns:wps="http://schemas.microsoft.com/office/word/2010/wordprocessingShape" xmlns:wpg="http://schemas.microsoft.com/office/word/2010/wordprocessingGroup" xmlns:w14="http://schemas.microsoft.com/office/word/2010/wordml" xmlns:w15="http://schemas.microsoft.com/office/word/2012/wordml">
+<w:comments xmlns:mc="http://schemas.openxmlformats.org/markup-compatibility/2006" xmlns:o="urn:schemas-microsoft-com:office:office" xmlns:r="http://schemas.openxmlformats.org/officeDocument/2006/relationships" xmlns:m="http://schemas.openxmlformats.org/officeDocument/2006/math" xmlns:v="urn:schemas-microsoft-com:vml" xmlns:wp="http://schemas.openxmlformats.org/drawingml/2006/wordprocessingDrawing" xmlns:w10="urn:schemas-microsoft-com:office:word" xmlns:w="http://schemas.openxmlformats.org/wordprocessingml/2006/main" xmlns:wne="http://schemas.microsoft.com/office/word/2006/wordml" xmlns:sl="http://schemas.openxmlformats.org/schemaLibrary/2006/main" xmlns:a="http://schemas.openxmlformats.org/drawingml/2006/main" xmlns:pic="http://schemas.openxmlformats.org/drawingml/2006/picture" xmlns:c="http://schemas.openxmlformats.org/drawingml/2006/chart" xmlns:lc="http://schemas.openxmlformats.org/drawingml/2006/lockedCanvas" xmlns:dgm="http://schemas.openxmlformats.org/drawingml/2006/diagram" xmlns:wps="http://schemas.microsoft.com/office/word/2010/wordprocessingShape" xmlns:wpg="http://schemas.microsoft.com/office/word/2010/wordprocessingGroup" xmlns:w14="http://schemas.microsoft.com/office/word/2010/wordml" xmlns:w15="http://schemas.microsoft.com/office/word/2012/wordml" xmlns:w16="http://schemas.microsoft.com/office/word/2018/wordml" xmlns:w16cex="http://schemas.microsoft.com/office/word/2018/wordml/cex" xmlns:w16cid="http://schemas.microsoft.com/office/word/2016/wordml/cid" xmlns="http://schemas.microsoft.com/office/tasks/2019/documenttasks" xmlns:cr="http://schemas.microsoft.com/office/comments/2020/reactions">
   <w:comment w:author="Amy Smith" w:id="0" w:date="2024-04-18T20:28:13Z">
     <w:p>
       <w:pPr>
@@ -1224,7 +1481,9 @@
         <w:rPr>
           <w:rFonts w:ascii="Arial" w:cs="Arial" w:eastAsia="Arial" w:hAnsi="Arial"/>
           <w:b w:val="0"/>
+          <w:bCs w:val="0"/>
           <w:i w:val="0"/>
+          <w:iCs w:val="0"/>
           <w:smallCaps w:val="0"/>
           <w:strike w:val="0"/>
           <w:color w:val="000000"/>
@@ -1239,7 +1498,9 @@
         <w:rPr>
           <w:rFonts w:ascii="Arial" w:cs="Arial" w:eastAsia="Arial" w:hAnsi="Arial"/>
           <w:b w:val="0"/>
+          <w:bCs w:val="0"/>
           <w:i w:val="0"/>
+          <w:iCs w:val="0"/>
           <w:smallCaps w:val="0"/>
           <w:strike w:val="0"/>
           <w:color w:val="000000"/>
@@ -1275,7 +1536,9 @@
         <w:rPr>
           <w:rFonts w:ascii="Arial" w:cs="Arial" w:eastAsia="Arial" w:hAnsi="Arial"/>
           <w:b w:val="0"/>
+          <w:bCs w:val="0"/>
           <w:i w:val="0"/>
+          <w:iCs w:val="0"/>
           <w:smallCaps w:val="0"/>
           <w:strike w:val="0"/>
           <w:color w:val="000000"/>
@@ -1290,7 +1553,9 @@
         <w:rPr>
           <w:rFonts w:ascii="Arial" w:cs="Arial" w:eastAsia="Arial" w:hAnsi="Arial"/>
           <w:b w:val="0"/>
+          <w:bCs w:val="0"/>
           <w:i w:val="0"/>
+          <w:iCs w:val="0"/>
           <w:smallCaps w:val="0"/>
           <w:strike w:val="0"/>
           <w:color w:val="000000"/>
@@ -1326,7 +1591,9 @@
         <w:rPr>
           <w:rFonts w:ascii="Arial" w:cs="Arial" w:eastAsia="Arial" w:hAnsi="Arial"/>
           <w:b w:val="0"/>
+          <w:bCs w:val="0"/>
           <w:i w:val="0"/>
+          <w:iCs w:val="0"/>
           <w:smallCaps w:val="0"/>
           <w:strike w:val="0"/>
           <w:color w:val="000000"/>
@@ -1341,7 +1608,9 @@
         <w:rPr>
           <w:rFonts w:ascii="Arial" w:cs="Arial" w:eastAsia="Arial" w:hAnsi="Arial"/>
           <w:b w:val="0"/>
+          <w:bCs w:val="0"/>
           <w:i w:val="0"/>
+          <w:iCs w:val="0"/>
           <w:smallCaps w:val="0"/>
           <w:strike w:val="0"/>
           <w:color w:val="000000"/>
@@ -1377,7 +1646,9 @@
         <w:rPr>
           <w:rFonts w:ascii="Arial" w:cs="Arial" w:eastAsia="Arial" w:hAnsi="Arial"/>
           <w:b w:val="0"/>
+          <w:bCs w:val="0"/>
           <w:i w:val="0"/>
+          <w:iCs w:val="0"/>
           <w:smallCaps w:val="0"/>
           <w:strike w:val="0"/>
           <w:color w:val="000000"/>
@@ -1392,7 +1663,9 @@
         <w:rPr>
           <w:rFonts w:ascii="Arial" w:cs="Arial" w:eastAsia="Arial" w:hAnsi="Arial"/>
           <w:b w:val="0"/>
+          <w:bCs w:val="0"/>
           <w:i w:val="0"/>
+          <w:iCs w:val="0"/>
           <w:smallCaps w:val="0"/>
           <w:strike w:val="0"/>
           <w:color w:val="000000"/>
@@ -1411,7 +1684,7 @@
 </file>
 
 <file path=word/footer1.xml><?xml version="1.0" encoding="utf-8"?>
-<w:ftr xmlns:mc="http://schemas.openxmlformats.org/markup-compatibility/2006" xmlns:o="urn:schemas-microsoft-com:office:office" xmlns:r="http://schemas.openxmlformats.org/officeDocument/2006/relationships" xmlns:m="http://schemas.openxmlformats.org/officeDocument/2006/math" xmlns:v="urn:schemas-microsoft-com:vml" xmlns:wp="http://schemas.openxmlformats.org/drawingml/2006/wordprocessingDrawing" xmlns:w10="urn:schemas-microsoft-com:office:word" xmlns:w="http://schemas.openxmlformats.org/wordprocessingml/2006/main" xmlns:wne="http://schemas.microsoft.com/office/word/2006/wordml" xmlns:sl="http://schemas.openxmlformats.org/schemaLibrary/2006/main" xmlns:a="http://schemas.openxmlformats.org/drawingml/2006/main" xmlns:pic="http://schemas.openxmlformats.org/drawingml/2006/picture" xmlns:c="http://schemas.openxmlformats.org/drawingml/2006/chart" xmlns:lc="http://schemas.openxmlformats.org/drawingml/2006/lockedCanvas" xmlns:dgm="http://schemas.openxmlformats.org/drawingml/2006/diagram" xmlns:wps="http://schemas.microsoft.com/office/word/2010/wordprocessingShape" xmlns:wpg="http://schemas.microsoft.com/office/word/2010/wordprocessingGroup" xmlns:w14="http://schemas.microsoft.com/office/word/2010/wordml" xmlns:w15="http://schemas.microsoft.com/office/word/2012/wordml">
+<w:ftr xmlns:mc="http://schemas.openxmlformats.org/markup-compatibility/2006" xmlns:o="urn:schemas-microsoft-com:office:office" xmlns:r="http://schemas.openxmlformats.org/officeDocument/2006/relationships" xmlns:m="http://schemas.openxmlformats.org/officeDocument/2006/math" xmlns:v="urn:schemas-microsoft-com:vml" xmlns:wp="http://schemas.openxmlformats.org/drawingml/2006/wordprocessingDrawing" xmlns:w10="urn:schemas-microsoft-com:office:word" xmlns:w="http://schemas.openxmlformats.org/wordprocessingml/2006/main" xmlns:wne="http://schemas.microsoft.com/office/word/2006/wordml" xmlns:sl="http://schemas.openxmlformats.org/schemaLibrary/2006/main" xmlns:a="http://schemas.openxmlformats.org/drawingml/2006/main" xmlns:pic="http://schemas.openxmlformats.org/drawingml/2006/picture" xmlns:c="http://schemas.openxmlformats.org/drawingml/2006/chart" xmlns:lc="http://schemas.openxmlformats.org/drawingml/2006/lockedCanvas" xmlns:dgm="http://schemas.openxmlformats.org/drawingml/2006/diagram" xmlns:wps="http://schemas.microsoft.com/office/word/2010/wordprocessingShape" xmlns:wpg="http://schemas.microsoft.com/office/word/2010/wordprocessingGroup" xmlns:w14="http://schemas.microsoft.com/office/word/2010/wordml" xmlns:w15="http://schemas.microsoft.com/office/word/2012/wordml" xmlns:w16="http://schemas.microsoft.com/office/word/2018/wordml" xmlns:w16cex="http://schemas.microsoft.com/office/word/2018/wordml/cex" xmlns:w16cid="http://schemas.microsoft.com/office/word/2016/wordml/cid" xmlns="http://schemas.microsoft.com/office/tasks/2019/documenttasks" xmlns:cr="http://schemas.microsoft.com/office/comments/2020/reactions">
   <w:p>
     <w:pPr>
       <w:pageBreakBefore w:val="0"/>
@@ -1435,7 +1708,7 @@
 </file>
 
 <file path=word/header1.xml><?xml version="1.0" encoding="utf-8"?>
-<w:hdr xmlns:mc="http://schemas.openxmlformats.org/markup-compatibility/2006" xmlns:o="urn:schemas-microsoft-com:office:office" xmlns:r="http://schemas.openxmlformats.org/officeDocument/2006/relationships" xmlns:m="http://schemas.openxmlformats.org/officeDocument/2006/math" xmlns:v="urn:schemas-microsoft-com:vml" xmlns:wp="http://schemas.openxmlformats.org/drawingml/2006/wordprocessingDrawing" xmlns:w10="urn:schemas-microsoft-com:office:word" xmlns:w="http://schemas.openxmlformats.org/wordprocessingml/2006/main" xmlns:wne="http://schemas.microsoft.com/office/word/2006/wordml" xmlns:sl="http://schemas.openxmlformats.org/schemaLibrary/2006/main" xmlns:a="http://schemas.openxmlformats.org/drawingml/2006/main" xmlns:pic="http://schemas.openxmlformats.org/drawingml/2006/picture" xmlns:c="http://schemas.openxmlformats.org/drawingml/2006/chart" xmlns:lc="http://schemas.openxmlformats.org/drawingml/2006/lockedCanvas" xmlns:dgm="http://schemas.openxmlformats.org/drawingml/2006/diagram" xmlns:wps="http://schemas.microsoft.com/office/word/2010/wordprocessingShape" xmlns:wpg="http://schemas.microsoft.com/office/word/2010/wordprocessingGroup" xmlns:w14="http://schemas.microsoft.com/office/word/2010/wordml" xmlns:w15="http://schemas.microsoft.com/office/word/2012/wordml">
+<w:hdr xmlns:mc="http://schemas.openxmlformats.org/markup-compatibility/2006" xmlns:o="urn:schemas-microsoft-com:office:office" xmlns:r="http://schemas.openxmlformats.org/officeDocument/2006/relationships" xmlns:m="http://schemas.openxmlformats.org/officeDocument/2006/math" xmlns:v="urn:schemas-microsoft-com:vml" xmlns:wp="http://schemas.openxmlformats.org/drawingml/2006/wordprocessingDrawing" xmlns:w10="urn:schemas-microsoft-com:office:word" xmlns:w="http://schemas.openxmlformats.org/wordprocessingml/2006/main" xmlns:wne="http://schemas.microsoft.com/office/word/2006/wordml" xmlns:sl="http://schemas.openxmlformats.org/schemaLibrary/2006/main" xmlns:a="http://schemas.openxmlformats.org/drawingml/2006/main" xmlns:pic="http://schemas.openxmlformats.org/drawingml/2006/picture" xmlns:c="http://schemas.openxmlformats.org/drawingml/2006/chart" xmlns:lc="http://schemas.openxmlformats.org/drawingml/2006/lockedCanvas" xmlns:dgm="http://schemas.openxmlformats.org/drawingml/2006/diagram" xmlns:wps="http://schemas.microsoft.com/office/word/2010/wordprocessingShape" xmlns:wpg="http://schemas.microsoft.com/office/word/2010/wordprocessingGroup" xmlns:w14="http://schemas.microsoft.com/office/word/2010/wordml" xmlns:w15="http://schemas.microsoft.com/office/word/2012/wordml" xmlns:w16="http://schemas.microsoft.com/office/word/2018/wordml" xmlns:w16cex="http://schemas.microsoft.com/office/word/2018/wordml/cex" xmlns:w16cid="http://schemas.microsoft.com/office/word/2016/wordml/cid" xmlns="http://schemas.microsoft.com/office/tasks/2019/documenttasks" xmlns:cr="http://schemas.microsoft.com/office/comments/2020/reactions">
   <w:p>
     <w:pPr>
       <w:pageBreakBefore w:val="0"/>
@@ -1463,7 +1736,7 @@
 </file>
 
 <file path=word/header2.xml><?xml version="1.0" encoding="utf-8"?>
-<w:hdr xmlns:mc="http://schemas.openxmlformats.org/markup-compatibility/2006" xmlns:o="urn:schemas-microsoft-com:office:office" xmlns:r="http://schemas.openxmlformats.org/officeDocument/2006/relationships" xmlns:m="http://schemas.openxmlformats.org/officeDocument/2006/math" xmlns:v="urn:schemas-microsoft-com:vml" xmlns:wp="http://schemas.openxmlformats.org/drawingml/2006/wordprocessingDrawing" xmlns:w10="urn:schemas-microsoft-com:office:word" xmlns:w="http://schemas.openxmlformats.org/wordprocessingml/2006/main" xmlns:wne="http://schemas.microsoft.com/office/word/2006/wordml" xmlns:sl="http://schemas.openxmlformats.org/schemaLibrary/2006/main" xmlns:a="http://schemas.openxmlformats.org/drawingml/2006/main" xmlns:pic="http://schemas.openxmlformats.org/drawingml/2006/picture" xmlns:c="http://schemas.openxmlformats.org/drawingml/2006/chart" xmlns:lc="http://schemas.openxmlformats.org/drawingml/2006/lockedCanvas" xmlns:dgm="http://schemas.openxmlformats.org/drawingml/2006/diagram" xmlns:wps="http://schemas.microsoft.com/office/word/2010/wordprocessingShape" xmlns:wpg="http://schemas.microsoft.com/office/word/2010/wordprocessingGroup" xmlns:w14="http://schemas.microsoft.com/office/word/2010/wordml" xmlns:w15="http://schemas.microsoft.com/office/word/2012/wordml">
+<w:hdr xmlns:mc="http://schemas.openxmlformats.org/markup-compatibility/2006" xmlns:o="urn:schemas-microsoft-com:office:office" xmlns:r="http://schemas.openxmlformats.org/officeDocument/2006/relationships" xmlns:m="http://schemas.openxmlformats.org/officeDocument/2006/math" xmlns:v="urn:schemas-microsoft-com:vml" xmlns:wp="http://schemas.openxmlformats.org/drawingml/2006/wordprocessingDrawing" xmlns:w10="urn:schemas-microsoft-com:office:word" xmlns:w="http://schemas.openxmlformats.org/wordprocessingml/2006/main" xmlns:wne="http://schemas.microsoft.com/office/word/2006/wordml" xmlns:sl="http://schemas.openxmlformats.org/schemaLibrary/2006/main" xmlns:a="http://schemas.openxmlformats.org/drawingml/2006/main" xmlns:pic="http://schemas.openxmlformats.org/drawingml/2006/picture" xmlns:c="http://schemas.openxmlformats.org/drawingml/2006/chart" xmlns:lc="http://schemas.openxmlformats.org/drawingml/2006/lockedCanvas" xmlns:dgm="http://schemas.openxmlformats.org/drawingml/2006/diagram" xmlns:wps="http://schemas.microsoft.com/office/word/2010/wordprocessingShape" xmlns:wpg="http://schemas.microsoft.com/office/word/2010/wordprocessingGroup" xmlns:w14="http://schemas.microsoft.com/office/word/2010/wordml" xmlns:w15="http://schemas.microsoft.com/office/word/2012/wordml" xmlns:w16="http://schemas.microsoft.com/office/word/2018/wordml" xmlns:w16cex="http://schemas.microsoft.com/office/word/2018/wordml/cex" xmlns:w16cid="http://schemas.microsoft.com/office/word/2016/wordml/cid" xmlns="http://schemas.microsoft.com/office/tasks/2019/documenttasks" xmlns:cr="http://schemas.microsoft.com/office/comments/2020/reactions">
   <w:p>
     <w:pPr>
       <w:pStyle w:val="Title"/>
@@ -1471,14 +1744,16 @@
       <w:rPr>
         <w:rFonts w:ascii="Calibri" w:cs="Calibri" w:eastAsia="Calibri" w:hAnsi="Calibri"/>
         <w:b w:val="1"/>
+        <w:bCs w:val="1"/>
       </w:rPr>
     </w:pPr>
-    <w:bookmarkStart w:colFirst="0" w:colLast="0" w:name="_5rf9wr4r3no2" w:id="18"/>
-    <w:bookmarkEnd w:id="18"/>
+    <w:bookmarkStart w:colFirst="0" w:colLast="0" w:name="_5rf9wr4r3no2" w:id="24"/>
+    <w:bookmarkEnd w:id="24"/>
     <w:r>
       <w:rPr>
         <w:rFonts w:ascii="Calibri" w:cs="Calibri" w:eastAsia="Calibri" w:hAnsi="Calibri"/>
         <w:b w:val="1"/>
+        <w:bCs w:val="1"/>
         <w:rtl w:val="0"/>
       </w:rPr>
       <w:t xml:space="preserve">Samantha Hughes</w:t>
@@ -1511,7 +1786,7 @@
 </file>
 
 <file path=word/numbering.xml><?xml version="1.0" encoding="utf-8"?>
-<w:numbering xmlns:mc="http://schemas.openxmlformats.org/markup-compatibility/2006" xmlns:o="urn:schemas-microsoft-com:office:office" xmlns:r="http://schemas.openxmlformats.org/officeDocument/2006/relationships" xmlns:m="http://schemas.openxmlformats.org/officeDocument/2006/math" xmlns:v="urn:schemas-microsoft-com:vml" xmlns:wp="http://schemas.openxmlformats.org/drawingml/2006/wordprocessingDrawing" xmlns:w10="urn:schemas-microsoft-com:office:word" xmlns:w="http://schemas.openxmlformats.org/wordprocessingml/2006/main" xmlns:wne="http://schemas.microsoft.com/office/word/2006/wordml" xmlns:sl="http://schemas.openxmlformats.org/schemaLibrary/2006/main" xmlns:a="http://schemas.openxmlformats.org/drawingml/2006/main" xmlns:pic="http://schemas.openxmlformats.org/drawingml/2006/picture" xmlns:c="http://schemas.openxmlformats.org/drawingml/2006/chart" xmlns:lc="http://schemas.openxmlformats.org/drawingml/2006/lockedCanvas" xmlns:dgm="http://schemas.openxmlformats.org/drawingml/2006/diagram" xmlns:wps="http://schemas.microsoft.com/office/word/2010/wordprocessingShape" xmlns:wpg="http://schemas.microsoft.com/office/word/2010/wordprocessingGroup" xmlns:w14="http://schemas.microsoft.com/office/word/2010/wordml" xmlns:w15="http://schemas.microsoft.com/office/word/2012/wordml">
+<w:numbering xmlns:mc="http://schemas.openxmlformats.org/markup-compatibility/2006" xmlns:o="urn:schemas-microsoft-com:office:office" xmlns:r="http://schemas.openxmlformats.org/officeDocument/2006/relationships" xmlns:m="http://schemas.openxmlformats.org/officeDocument/2006/math" xmlns:v="urn:schemas-microsoft-com:vml" xmlns:wp="http://schemas.openxmlformats.org/drawingml/2006/wordprocessingDrawing" xmlns:w10="urn:schemas-microsoft-com:office:word" xmlns:w="http://schemas.openxmlformats.org/wordprocessingml/2006/main" xmlns:wne="http://schemas.microsoft.com/office/word/2006/wordml" xmlns:sl="http://schemas.openxmlformats.org/schemaLibrary/2006/main" xmlns:a="http://schemas.openxmlformats.org/drawingml/2006/main" xmlns:pic="http://schemas.openxmlformats.org/drawingml/2006/picture" xmlns:c="http://schemas.openxmlformats.org/drawingml/2006/chart" xmlns:lc="http://schemas.openxmlformats.org/drawingml/2006/lockedCanvas" xmlns:dgm="http://schemas.openxmlformats.org/drawingml/2006/diagram" xmlns:wps="http://schemas.microsoft.com/office/word/2010/wordprocessingShape" xmlns:wpg="http://schemas.microsoft.com/office/word/2010/wordprocessingGroup" xmlns:w14="http://schemas.microsoft.com/office/word/2010/wordml" xmlns:w15="http://schemas.microsoft.com/office/word/2012/wordml" xmlns:w16="http://schemas.microsoft.com/office/word/2018/wordml" xmlns:w16cex="http://schemas.microsoft.com/office/word/2018/wordml/cex" xmlns:w16cid="http://schemas.microsoft.com/office/word/2016/wordml/cid" xmlns="http://schemas.microsoft.com/office/tasks/2019/documenttasks" xmlns:cr="http://schemas.microsoft.com/office/comments/2020/reactions">
   <w:abstractNum w:abstractNumId="1">
     <w:lvl w:ilvl="0">
       <w:start w:val="1"/>
@@ -1968,7 +2243,7 @@
 </file>
 
 <file path=word/styles.xml><?xml version="1.0" encoding="utf-8"?>
-<w:styles xmlns:mc="http://schemas.openxmlformats.org/markup-compatibility/2006" xmlns:o="urn:schemas-microsoft-com:office:office" xmlns:r="http://schemas.openxmlformats.org/officeDocument/2006/relationships" xmlns:m="http://schemas.openxmlformats.org/officeDocument/2006/math" xmlns:v="urn:schemas-microsoft-com:vml" xmlns:wp="http://schemas.openxmlformats.org/drawingml/2006/wordprocessingDrawing" xmlns:w10="urn:schemas-microsoft-com:office:word" xmlns:w="http://schemas.openxmlformats.org/wordprocessingml/2006/main" xmlns:wne="http://schemas.microsoft.com/office/word/2006/wordml" xmlns:sl="http://schemas.openxmlformats.org/schemaLibrary/2006/main" xmlns:a="http://schemas.openxmlformats.org/drawingml/2006/main" xmlns:pic="http://schemas.openxmlformats.org/drawingml/2006/picture" xmlns:c="http://schemas.openxmlformats.org/drawingml/2006/chart" xmlns:lc="http://schemas.openxmlformats.org/drawingml/2006/lockedCanvas" xmlns:dgm="http://schemas.openxmlformats.org/drawingml/2006/diagram" xmlns:wps="http://schemas.microsoft.com/office/word/2010/wordprocessingShape" xmlns:wpg="http://schemas.microsoft.com/office/word/2010/wordprocessingGroup" xmlns:w14="http://schemas.microsoft.com/office/word/2010/wordml" xmlns:w15="http://schemas.microsoft.com/office/word/2012/wordml">
+<w:styles xmlns:mc="http://schemas.openxmlformats.org/markup-compatibility/2006" xmlns:o="urn:schemas-microsoft-com:office:office" xmlns:r="http://schemas.openxmlformats.org/officeDocument/2006/relationships" xmlns:m="http://schemas.openxmlformats.org/officeDocument/2006/math" xmlns:v="urn:schemas-microsoft-com:vml" xmlns:wp="http://schemas.openxmlformats.org/drawingml/2006/wordprocessingDrawing" xmlns:w10="urn:schemas-microsoft-com:office:word" xmlns:w="http://schemas.openxmlformats.org/wordprocessingml/2006/main" xmlns:wne="http://schemas.microsoft.com/office/word/2006/wordml" xmlns:sl="http://schemas.openxmlformats.org/schemaLibrary/2006/main" xmlns:a="http://schemas.openxmlformats.org/drawingml/2006/main" xmlns:pic="http://schemas.openxmlformats.org/drawingml/2006/picture" xmlns:c="http://schemas.openxmlformats.org/drawingml/2006/chart" xmlns:lc="http://schemas.openxmlformats.org/drawingml/2006/lockedCanvas" xmlns:dgm="http://schemas.openxmlformats.org/drawingml/2006/diagram" xmlns:wps="http://schemas.microsoft.com/office/word/2010/wordprocessingShape" xmlns:wpg="http://schemas.microsoft.com/office/word/2010/wordprocessingGroup" xmlns:w14="http://schemas.microsoft.com/office/word/2010/wordml" xmlns:w15="http://schemas.microsoft.com/office/word/2012/wordml" xmlns:w16="http://schemas.microsoft.com/office/word/2018/wordml" xmlns:w16cex="http://schemas.microsoft.com/office/word/2018/wordml/cex" xmlns:w16cid="http://schemas.microsoft.com/office/word/2016/wordml/cid" xmlns="http://schemas.microsoft.com/office/tasks/2019/documenttasks" xmlns:cr="http://schemas.microsoft.com/office/comments/2020/reactions">
   <w:docDefaults>
     <w:rPrDefault>
       <w:rPr>
@@ -1982,11 +2257,19 @@
       </w:pPr>
     </w:pPrDefault>
   </w:docDefaults>
+  <w:style w:type="table" w:styleId="TableNormal" w:default="1">
+    <w:name w:val="TableNormal"/>
+    <w:tblPr>
+      <w:tblCellMar>
+        <w:top w:w="100.0" w:type="dxa"/>
+        <w:left w:w="100.0" w:type="dxa"/>
+        <w:bottom w:w="100.0" w:type="dxa"/>
+        <w:right w:w="100.0" w:type="dxa"/>
+      </w:tblCellMar>
+    </w:tblPr>
+  </w:style>
   <w:style w:type="paragraph" w:styleId="Normal" w:default="1">
     <w:name w:val="normal"/>
-  </w:style>
-  <w:style w:type="table" w:styleId="TableNormal" w:default="1">
-    <w:name w:val="Table Normal"/>
   </w:style>
   <w:style w:type="paragraph" w:styleId="Heading1">
     <w:name w:val="heading 1"/>
@@ -2002,6 +2285,7 @@
     <w:rPr>
       <w:rFonts w:ascii="Calibri" w:cs="Calibri" w:eastAsia="Calibri" w:hAnsi="Calibri"/>
       <w:b w:val="1"/>
+      <w:bCs w:val="1"/>
       <w:sz w:val="32"/>
       <w:szCs w:val="32"/>
     </w:rPr>
@@ -2083,6 +2367,7 @@
     <w:rPr>
       <w:rFonts w:ascii="Trebuchet MS" w:cs="Trebuchet MS" w:eastAsia="Trebuchet MS" w:hAnsi="Trebuchet MS"/>
       <w:i w:val="1"/>
+      <w:iCs w:val="1"/>
       <w:color w:val="666666"/>
       <w:sz w:val="22"/>
       <w:szCs w:val="22"/>
@@ -2115,6 +2400,11 @@
       <w:sz w:val="24"/>
       <w:szCs w:val="24"/>
     </w:rPr>
+  </w:style>
+  <w:style w:type="paragraph" w:styleId="TableofFigures">
+    <w:name w:val="table of figures"/>
+    <w:basedOn w:val="Normal"/>
+    <w:next w:val="Normal"/>
   </w:style>
 </w:styles>
 </file>

</xml_diff>

<commit_message>
resume: typography pass for pdf and docx
PDF: Plex Sans Text, centred header, balanced contact lines, accent
section heads. docx: Arial throughout so Pages and Word need no font
substitution, dates on the role line, one page. Adds
`pixi run resume-reference` to regenerate the Word reference doc.

Co-Authored-By: Claude Opus 5.5 <noreply@anthropic.com>
</commit_message>
<xml_diff>
--- a/frontend/public/Samantha_Hughes_Resume.docx
+++ b/frontend/public/Samantha_Hughes_Resume.docx
@@ -276,15 +276,16 @@
         </w:rPr>
         <w:t xml:space="preserve">Staff Software Engineer</w:t>
       </w:r>
+      <w:r>
+        <w:tab/>
+      </w:r>
+      <w:r>
+        <w:rPr>
+          <w:rStyle w:val="RoleDates"/>
+        </w:rPr>
+        <w:t xml:space="preserve">Sep 2025 -&gt; Present</w:t>
+      </w:r>
       <w:bookmarkEnd w:id="19"/>
-    </w:p>
-    <w:p>
-      <w:pPr>
-        <w:pStyle w:val="Dates"/>
-      </w:pPr>
-      <w:r>
-        <w:t xml:space="preserve">Sep 2025 -&gt; Present</w:t>
-      </w:r>
     </w:p>
     <w:p>
       <w:pPr>
@@ -429,15 +430,16 @@
         </w:rPr>
         <w:t xml:space="preserve">Senior Lead Software Engineer</w:t>
       </w:r>
+      <w:r>
+        <w:tab/>
+      </w:r>
+      <w:r>
+        <w:rPr>
+          <w:rStyle w:val="RoleDates"/>
+        </w:rPr>
+        <w:t xml:space="preserve">Mar 2025 -&gt; Sep 2025</w:t>
+      </w:r>
       <w:bookmarkEnd w:id="22"/>
-    </w:p>
-    <w:p>
-      <w:pPr>
-        <w:pStyle w:val="Dates"/>
-      </w:pPr>
-      <w:r>
-        <w:t xml:space="preserve">Mar 2025 -&gt; Sep 2025</w:t>
-      </w:r>
     </w:p>
     <w:p>
       <w:pPr>
@@ -491,15 +493,16 @@
         </w:rPr>
         <w:t xml:space="preserve">Staff Software Engineer</w:t>
       </w:r>
+      <w:r>
+        <w:tab/>
+      </w:r>
+      <w:r>
+        <w:rPr>
+          <w:rStyle w:val="RoleDates"/>
+        </w:rPr>
+        <w:t xml:space="preserve">Jun 2024 -&gt; Mar 2025</w:t>
+      </w:r>
       <w:bookmarkEnd w:id="23"/>
-    </w:p>
-    <w:p>
-      <w:pPr>
-        <w:pStyle w:val="Dates"/>
-      </w:pPr>
-      <w:r>
-        <w:t xml:space="preserve">Jun 2024 -&gt; Mar 2025</w:t>
-      </w:r>
     </w:p>
     <w:p>
       <w:pPr>
@@ -541,15 +544,16 @@
         </w:rPr>
         <w:t xml:space="preserve">Software Engineer -&gt; Software Engineering Team Lead -&gt; Staff Software Engineer</w:t>
       </w:r>
+      <w:r>
+        <w:tab/>
+      </w:r>
+      <w:r>
+        <w:rPr>
+          <w:rStyle w:val="RoleDates"/>
+        </w:rPr>
+        <w:t xml:space="preserve">Mar 2021 -&gt; May 2024</w:t>
+      </w:r>
       <w:bookmarkEnd w:id="24"/>
-    </w:p>
-    <w:p>
-      <w:pPr>
-        <w:pStyle w:val="Dates"/>
-      </w:pPr>
-      <w:r>
-        <w:t xml:space="preserve">Mar 2021 -&gt; May 2024</w:t>
-      </w:r>
     </w:p>
     <w:p>
       <w:pPr>
@@ -646,15 +650,16 @@
         </w:rPr>
         <w:t xml:space="preserve">Lead Software Engineer</w:t>
       </w:r>
+      <w:r>
+        <w:tab/>
+      </w:r>
+      <w:r>
+        <w:rPr>
+          <w:rStyle w:val="RoleDates"/>
+        </w:rPr>
+        <w:t xml:space="preserve">May 2019 -&gt; Mar 2021</w:t>
+      </w:r>
       <w:bookmarkEnd w:id="27"/>
-    </w:p>
-    <w:p>
-      <w:pPr>
-        <w:pStyle w:val="Dates"/>
-      </w:pPr>
-      <w:r>
-        <w:t xml:space="preserve">May 2019 -&gt; Mar 2021</w:t>
-      </w:r>
     </w:p>
     <w:p>
       <w:pPr>
@@ -696,15 +701,16 @@
         </w:rPr>
         <w:t xml:space="preserve">Data Engineer</w:t>
       </w:r>
+      <w:r>
+        <w:tab/>
+      </w:r>
+      <w:r>
+        <w:rPr>
+          <w:rStyle w:val="RoleDates"/>
+        </w:rPr>
+        <w:t xml:space="preserve">Feb 2018 -&gt; May 2019</w:t>
+      </w:r>
       <w:bookmarkEnd w:id="28"/>
-    </w:p>
-    <w:p>
-      <w:pPr>
-        <w:pStyle w:val="Dates"/>
-      </w:pPr>
-      <w:r>
-        <w:t xml:space="preserve">Feb 2018 -&gt; May 2019</w:t>
-      </w:r>
     </w:p>
     <w:p>
       <w:pPr>
@@ -746,15 +752,16 @@
         </w:rPr>
         <w:t xml:space="preserve">Junior Internal Data Scientist</w:t>
       </w:r>
+      <w:r>
+        <w:tab/>
+      </w:r>
+      <w:r>
+        <w:rPr>
+          <w:rStyle w:val="RoleDates"/>
+        </w:rPr>
+        <w:t xml:space="preserve">Apr 2017 -&gt; Feb 2018</w:t>
+      </w:r>
       <w:bookmarkEnd w:id="29"/>
-    </w:p>
-    <w:p>
-      <w:pPr>
-        <w:pStyle w:val="Dates"/>
-      </w:pPr>
-      <w:r>
-        <w:t xml:space="preserve">Apr 2017 -&gt; Feb 2018</w:t>
-      </w:r>
     </w:p>
     <w:p>
       <w:pPr>
@@ -790,6 +797,9 @@
       <w:footnotePr>
         <w:numRestart w:val="eachSect"/>
       </w:footnotePr>
+      <w:pgSz w:w="12240" w:h="15840"/>
+      <w:pgMar w:top="720" w:right="792" w:bottom="576" w:left="792" w:header="360" w:footer="360" w:gutter="0"/>
+      <w:cols w:space="720"/>
     </w:sectPr>
   </w:body>
 </w:document>
@@ -1034,15 +1044,15 @@
   <w:docDefaults>
     <w:rPrDefault>
       <w:rPr>
-        <w:rFonts w:ascii="Calibri" w:hAnsi="Calibri" w:eastAsia="Calibri" w:cs="Calibri"/>
-        <w:sz w:val="20"/>
-        <w:szCs w:val="20"/>
-        <w:lang w:val="en-US" w:eastAsia="zh-CN" w:bidi="ar-SA"/>
+        <w:rFonts w:ascii="Arial" w:hAnsi="Arial" w:eastAsia="Arial" w:cs="Arial"/>
+        <w:sz w:val="19"/>
+        <w:szCs w:val="19"/>
+        <w:lang w:val="en-US" w:eastAsia="en-US" w:bidi="ar-SA"/>
       </w:rPr>
     </w:rPrDefault>
     <w:pPrDefault>
       <w:pPr>
-        <w:spacing w:after="0"/>
+        <w:spacing w:after="0" w:line="240" w:lineRule="auto"/>
       </w:pPr>
     </w:pPrDefault>
   </w:docDefaults>
@@ -1050,10 +1060,16 @@
   <w:style w:type="paragraph" w:default="1" w:styleId="Normal">
     <w:name w:val="Normal"/>
     <w:qFormat/>
-    <w:rPr>
-      <w:rFonts w:ascii="Calibri" w:hAnsi="Calibri" w:eastAsia="Calibri" w:cs="Calibri"/>
-      <w:sz w:val="20"/>
-      <w:szCs w:val="20"/>
+    <w:pPr>
+      <w:widowControl/>
+      <w:spacing w:before="0" w:after="0" w:line="230" w:lineRule="exact"/>
+    </w:pPr>
+    <w:rPr>
+      <w:rFonts w:ascii="Arial" w:hAnsi="Arial" w:eastAsia="Arial" w:cs="Arial"/>
+      <w:color w:val="1B1B1F"/>
+      <w:sz w:val="19"/>
+      <w:szCs w:val="19"/>
+      <w:lang w:val="en-US"/>
     </w:rPr>
   </w:style>
   <w:style w:type="paragraph" w:styleId="BodyText">
@@ -1070,6 +1086,7 @@
     <w:basedOn w:val="BodyText"/>
     <w:next w:val="BodyText"/>
     <w:qFormat/>
+    <w:pPr/>
   </w:style>
   <w:style w:type="paragraph" w:customStyle="1" w:styleId="Compact">
     <w:name w:val="Compact"/>
@@ -1086,28 +1103,33 @@
     <w:link w:val="TitleChar"/>
     <w:uiPriority w:val="10"/>
     <w:qFormat/>
-    <w:rsid w:val="00A10FD9"/>
-    <w:pPr>
-      <w:spacing w:after="80" w:line="240" w:lineRule="auto"/>
-      <w:contextualSpacing/>
-      <w:jc w:val="center"/>
-    </w:pPr>
-    <w:rPr>
-      <w:rFonts w:ascii="Calibri" w:hAnsi="Calibri" w:eastAsia="Calibri" w:cs="Calibri"/>
-      <w:sz w:val="56"/>
-      <w:szCs w:val="56"/>
+    <w:pPr>
+      <w:keepNext/>
+      <w:keepLines/>
+      <w:spacing w:before="0" w:after="40" w:line="240" w:lineRule="auto"/>
+    </w:pPr>
+    <w:rPr>
+      <w:rFonts w:ascii="Arial" w:hAnsi="Arial" w:eastAsia="Arial" w:cs="Arial"/>
+      <w:b/>
+      <w:bCs/>
+      <w:color w:val="1B1B1F"/>
+      <w:kern w:val="28"/>
+      <w:sz w:val="36"/>
+      <w:szCs w:val="36"/>
     </w:rPr>
   </w:style>
   <w:style w:type="character" w:customStyle="1" w:styleId="TitleChar">
     <w:name w:val="Title Char"/>
     <w:basedOn w:val="DefaultParagraphFont"/>
     <w:link w:val="Title"/>
-    <w:uiPriority w:val="10"/>
-    <w:rsid w:val="00A10FD9"/>
-    <w:rPr>
-      <w:rFonts w:ascii="Calibri" w:hAnsi="Calibri" w:eastAsia="Calibri" w:cs="Calibri"/>
-      <w:sz w:val="56"/>
-      <w:szCs w:val="56"/>
+    <w:rPr>
+      <w:rFonts w:ascii="Arial" w:hAnsi="Arial" w:eastAsia="Arial" w:cs="Arial"/>
+      <w:b/>
+      <w:bCs/>
+      <w:color w:val="1B1B1F"/>
+      <w:kern w:val="28"/>
+      <w:sz w:val="36"/>
+      <w:szCs w:val="36"/>
     </w:rPr>
   </w:style>
   <w:style w:type="paragraph" w:styleId="Subtitle">
@@ -1124,7 +1146,7 @@
       </w:numPr>
     </w:pPr>
     <w:rPr>
-      <w:rFonts w:ascii="Calibri" w:hAnsi="Calibri" w:eastAsia="Calibri" w:cs="Calibri"/>
+      <w:rFonts w:ascii="Arial" w:hAnsi="Arial" w:eastAsia="Arial" w:cs="Arial"/>
       <w:spacing w:val="15"/>
       <w:sz w:val="28"/>
       <w:szCs w:val="28"/>
@@ -1137,8 +1159,8 @@
     <w:uiPriority w:val="11"/>
     <w:rsid w:val="00A10FD9"/>
     <w:rPr>
-      <w:rFonts w:ascii="Calibri" w:hAnsi="Calibri" w:eastAsia="Calibri" w:cs="Calibri"/>
-      <w:color w:val="111111"/>
+      <w:rFonts w:ascii="Arial" w:hAnsi="Arial" w:eastAsia="Arial" w:cs="Arial"/>
+      <w:color w:val="1B1B1F"/>
       <w:spacing w:val="15"/>
       <w:sz w:val="28"/>
       <w:szCs w:val="28"/>
@@ -1219,18 +1241,20 @@
     <w:link w:val="Heading1Char"/>
     <w:uiPriority w:val="9"/>
     <w:qFormat/>
-    <w:rsid w:val="00A10FD9"/>
     <w:pPr>
       <w:keepNext/>
-      <w:spacing w:before="0" w:after="40"/>
+      <w:keepLines/>
+      <w:spacing w:before="0" w:after="40" w:line="240" w:lineRule="auto"/>
       <w:outlineLvl w:val="0"/>
     </w:pPr>
     <w:rPr>
-      <w:rFonts w:ascii="Calibri" w:hAnsi="Calibri" w:eastAsia="Calibri" w:cs="Calibri"/>
+      <w:rFonts w:ascii="Arial" w:hAnsi="Arial" w:eastAsia="Arial" w:cs="Arial"/>
       <w:b/>
-      <w:color w:val="111111"/>
-      <w:sz w:val="40"/>
-      <w:szCs w:val="40"/>
+      <w:bCs/>
+      <w:color w:val="1B1B1F"/>
+      <w:kern w:val="28"/>
+      <w:sz w:val="36"/>
+      <w:szCs w:val="36"/>
     </w:rPr>
   </w:style>
   <w:style w:type="paragraph" w:styleId="Heading2">
@@ -1239,48 +1263,48 @@
     <w:next w:val="BodyText"/>
     <w:link w:val="Heading2Char"/>
     <w:uiPriority w:val="9"/>
-    <w:semiHidden/>
-    <w:unhideWhenUsed/>
-    <w:qFormat/>
-    <w:rsid w:val="00A10FD9"/>
+    <w:qFormat/>
     <w:pPr>
       <w:keepNext/>
       <w:keepLines/>
       <w:pBdr>
-        <w:bottom w:val="single" w:sz="4" w:space="1" w:color="999999"/>
+        <w:bottom w:val="single" w:sz="4" w:space="1" w:color="C4C8CF"/>
       </w:pBdr>
-      <w:spacing w:before="200" w:after="60"/>
+      <w:spacing w:before="140" w:after="60" w:line="240" w:lineRule="auto"/>
       <w:outlineLvl w:val="1"/>
     </w:pPr>
     <w:rPr>
-      <w:rFonts w:ascii="Calibri" w:hAnsi="Calibri" w:eastAsia="Calibri" w:cs="Calibri"/>
+      <w:rFonts w:ascii="Arial" w:hAnsi="Arial" w:eastAsia="Arial" w:cs="Arial"/>
       <w:b/>
-      <w:color w:val="111111"/>
-      <w:sz w:val="26"/>
-      <w:szCs w:val="26"/>
+      <w:bCs/>
+      <w:caps/>
+      <w:color w:val="1F4F8F"/>
+      <w:spacing w:val="16"/>
+      <w:sz w:val="20"/>
+      <w:szCs w:val="20"/>
     </w:rPr>
   </w:style>
   <w:style w:type="paragraph" w:styleId="Heading3">
     <w:name w:val="heading 3"/>
     <w:basedOn w:val="Normal"/>
-    <w:next w:val="BodyText"/>
+    <w:next w:val="Dates"/>
     <w:link w:val="Heading3Char"/>
     <w:uiPriority w:val="9"/>
-    <w:semiHidden/>
-    <w:unhideWhenUsed/>
-    <w:qFormat/>
-    <w:rsid w:val="00A10FD9"/>
+    <w:qFormat/>
     <w:pPr>
       <w:keepNext/>
       <w:keepLines/>
-      <w:spacing w:before="140" w:after="0"/>
+      <w:tabs>
+        <w:tab w:val="right" w:pos="10656"/>
+      </w:tabs>
+      <w:spacing w:before="100" w:after="0" w:line="260" w:lineRule="exact"/>
       <w:outlineLvl w:val="2"/>
     </w:pPr>
     <w:rPr>
-      <w:rFonts w:ascii="Calibri" w:hAnsi="Calibri" w:eastAsia="Calibri" w:cs="Calibri"/>
-      <w:color w:val="111111"/>
-      <w:sz w:val="21"/>
-      <w:szCs w:val="21"/>
+      <w:rFonts w:ascii="Arial" w:hAnsi="Arial" w:eastAsia="Arial" w:cs="Arial"/>
+      <w:color w:val="1B1B1F"/>
+      <w:sz w:val="20"/>
+      <w:szCs w:val="20"/>
     </w:rPr>
   </w:style>
   <w:style w:type="paragraph" w:styleId="Heading4">
@@ -1300,10 +1324,10 @@
       <w:outlineLvl w:val="3"/>
     </w:pPr>
     <w:rPr>
-      <w:rFonts w:ascii="Calibri" w:hAnsi="Calibri" w:eastAsia="Calibri" w:cs="Calibri"/>
+      <w:rFonts w:ascii="Arial" w:hAnsi="Arial" w:eastAsia="Arial" w:cs="Arial"/>
       <w:i/>
       <w:iCs/>
-      <w:color w:val="111111"/>
+      <w:color w:val="1B1B1F"/>
     </w:rPr>
   </w:style>
   <w:style w:type="paragraph" w:styleId="Heading5">
@@ -1323,8 +1347,8 @@
       <w:outlineLvl w:val="4"/>
     </w:pPr>
     <w:rPr>
-      <w:rFonts w:ascii="Calibri" w:hAnsi="Calibri" w:eastAsia="Calibri" w:cs="Calibri"/>
-      <w:color w:val="111111"/>
+      <w:rFonts w:ascii="Arial" w:hAnsi="Arial" w:eastAsia="Arial" w:cs="Arial"/>
+      <w:color w:val="1B1B1F"/>
     </w:rPr>
   </w:style>
   <w:style w:type="paragraph" w:styleId="Heading6">
@@ -1344,10 +1368,10 @@
       <w:outlineLvl w:val="5"/>
     </w:pPr>
     <w:rPr>
-      <w:rFonts w:ascii="Calibri" w:hAnsi="Calibri" w:eastAsia="Calibri" w:cs="Calibri"/>
+      <w:rFonts w:ascii="Arial" w:hAnsi="Arial" w:eastAsia="Arial" w:cs="Arial"/>
       <w:i/>
       <w:iCs/>
-      <w:color w:val="111111"/>
+      <w:color w:val="1B1B1F"/>
     </w:rPr>
   </w:style>
   <w:style w:type="paragraph" w:styleId="Heading7">
@@ -1367,8 +1391,8 @@
       <w:outlineLvl w:val="6"/>
     </w:pPr>
     <w:rPr>
-      <w:rFonts w:ascii="Calibri" w:hAnsi="Calibri" w:eastAsia="Calibri" w:cs="Calibri"/>
-      <w:color w:val="111111"/>
+      <w:rFonts w:ascii="Arial" w:hAnsi="Arial" w:eastAsia="Arial" w:cs="Arial"/>
+      <w:color w:val="1B1B1F"/>
     </w:rPr>
   </w:style>
   <w:style w:type="paragraph" w:styleId="Heading8">
@@ -1388,10 +1412,10 @@
       <w:outlineLvl w:val="7"/>
     </w:pPr>
     <w:rPr>
-      <w:rFonts w:ascii="Calibri" w:hAnsi="Calibri" w:eastAsia="Calibri" w:cs="Calibri"/>
+      <w:rFonts w:ascii="Arial" w:hAnsi="Arial" w:eastAsia="Arial" w:cs="Arial"/>
       <w:i/>
       <w:iCs/>
-      <w:color w:val="111111"/>
+      <w:color w:val="1B1B1F"/>
     </w:rPr>
   </w:style>
   <w:style w:type="paragraph" w:styleId="Heading9">
@@ -1411,8 +1435,8 @@
       <w:outlineLvl w:val="8"/>
     </w:pPr>
     <w:rPr>
-      <w:rFonts w:ascii="Calibri" w:hAnsi="Calibri" w:eastAsia="Calibri" w:cs="Calibri"/>
-      <w:color w:val="111111"/>
+      <w:rFonts w:ascii="Arial" w:hAnsi="Arial" w:eastAsia="Arial" w:cs="Arial"/>
+      <w:color w:val="1B1B1F"/>
     </w:rPr>
   </w:style>
   <w:style w:type="character" w:customStyle="1" w:styleId="Heading1Char">
@@ -1420,12 +1444,14 @@
     <w:basedOn w:val="DefaultParagraphFont"/>
     <w:link w:val="Heading1"/>
     <w:uiPriority w:val="9"/>
-    <w:rsid w:val="00A10FD9"/>
-    <w:rPr>
-      <w:rFonts w:ascii="Calibri" w:hAnsi="Calibri" w:eastAsia="Calibri" w:cs="Calibri"/>
-      <w:color w:val="111111"/>
-      <w:sz w:val="40"/>
-      <w:szCs w:val="40"/>
+    <w:rPr>
+      <w:rFonts w:ascii="Arial" w:hAnsi="Arial" w:eastAsia="Arial" w:cs="Arial"/>
+      <w:b/>
+      <w:bCs/>
+      <w:color w:val="1B1B1F"/>
+      <w:kern w:val="28"/>
+      <w:sz w:val="36"/>
+      <w:szCs w:val="36"/>
     </w:rPr>
   </w:style>
   <w:style w:type="character" w:customStyle="1" w:styleId="Heading2Char">
@@ -1433,13 +1459,15 @@
     <w:basedOn w:val="DefaultParagraphFont"/>
     <w:link w:val="Heading2"/>
     <w:uiPriority w:val="9"/>
-    <w:semiHidden/>
-    <w:rsid w:val="00A10FD9"/>
-    <w:rPr>
-      <w:rFonts w:ascii="Calibri" w:hAnsi="Calibri" w:eastAsia="Calibri" w:cs="Calibri"/>
-      <w:color w:val="111111"/>
-      <w:sz w:val="32"/>
-      <w:szCs w:val="32"/>
+    <w:rPr>
+      <w:rFonts w:ascii="Arial" w:hAnsi="Arial" w:eastAsia="Arial" w:cs="Arial"/>
+      <w:b/>
+      <w:bCs/>
+      <w:caps/>
+      <w:color w:val="1F4F8F"/>
+      <w:spacing w:val="16"/>
+      <w:sz w:val="20"/>
+      <w:szCs w:val="20"/>
     </w:rPr>
   </w:style>
   <w:style w:type="character" w:customStyle="1" w:styleId="Heading3Char">
@@ -1447,13 +1475,11 @@
     <w:basedOn w:val="DefaultParagraphFont"/>
     <w:link w:val="Heading3"/>
     <w:uiPriority w:val="9"/>
-    <w:semiHidden/>
-    <w:rsid w:val="00A10FD9"/>
-    <w:rPr>
-      <w:rFonts w:ascii="Calibri" w:hAnsi="Calibri" w:eastAsia="Calibri" w:cs="Calibri"/>
-      <w:color w:val="111111"/>
-      <w:sz w:val="28"/>
-      <w:szCs w:val="28"/>
+    <w:rPr>
+      <w:rFonts w:ascii="Arial" w:hAnsi="Arial" w:eastAsia="Arial" w:cs="Arial"/>
+      <w:color w:val="1B1B1F"/>
+      <w:sz w:val="20"/>
+      <w:szCs w:val="20"/>
     </w:rPr>
   </w:style>
   <w:style w:type="character" w:customStyle="1" w:styleId="Heading4Char">
@@ -1464,10 +1490,10 @@
     <w:semiHidden/>
     <w:rsid w:val="00A10FD9"/>
     <w:rPr>
-      <w:rFonts w:ascii="Calibri" w:hAnsi="Calibri" w:eastAsia="Calibri" w:cs="Calibri"/>
+      <w:rFonts w:ascii="Arial" w:hAnsi="Arial" w:eastAsia="Arial" w:cs="Arial"/>
       <w:i/>
       <w:iCs/>
-      <w:color w:val="111111"/>
+      <w:color w:val="1B1B1F"/>
     </w:rPr>
   </w:style>
   <w:style w:type="character" w:customStyle="1" w:styleId="Heading5Char">
@@ -1478,8 +1504,8 @@
     <w:semiHidden/>
     <w:rsid w:val="00A10FD9"/>
     <w:rPr>
-      <w:rFonts w:ascii="Calibri" w:hAnsi="Calibri" w:eastAsia="Calibri" w:cs="Calibri"/>
-      <w:color w:val="111111"/>
+      <w:rFonts w:ascii="Arial" w:hAnsi="Arial" w:eastAsia="Arial" w:cs="Arial"/>
+      <w:color w:val="1B1B1F"/>
     </w:rPr>
   </w:style>
   <w:style w:type="character" w:customStyle="1" w:styleId="Heading6Char">
@@ -1490,10 +1516,10 @@
     <w:semiHidden/>
     <w:rsid w:val="00A10FD9"/>
     <w:rPr>
-      <w:rFonts w:ascii="Calibri" w:hAnsi="Calibri" w:eastAsia="Calibri" w:cs="Calibri"/>
+      <w:rFonts w:ascii="Arial" w:hAnsi="Arial" w:eastAsia="Arial" w:cs="Arial"/>
       <w:i/>
       <w:iCs/>
-      <w:color w:val="111111"/>
+      <w:color w:val="1B1B1F"/>
     </w:rPr>
   </w:style>
   <w:style w:type="character" w:customStyle="1" w:styleId="Heading7Char">
@@ -1504,8 +1530,8 @@
     <w:semiHidden/>
     <w:rsid w:val="00A10FD9"/>
     <w:rPr>
-      <w:rFonts w:ascii="Calibri" w:hAnsi="Calibri" w:eastAsia="Calibri" w:cs="Calibri"/>
-      <w:color w:val="111111"/>
+      <w:rFonts w:ascii="Arial" w:hAnsi="Arial" w:eastAsia="Arial" w:cs="Arial"/>
+      <w:color w:val="1B1B1F"/>
     </w:rPr>
   </w:style>
   <w:style w:type="character" w:customStyle="1" w:styleId="Heading8Char">
@@ -1516,10 +1542,10 @@
     <w:semiHidden/>
     <w:rsid w:val="00A10FD9"/>
     <w:rPr>
-      <w:rFonts w:ascii="Calibri" w:hAnsi="Calibri" w:eastAsia="Calibri" w:cs="Calibri"/>
+      <w:rFonts w:ascii="Arial" w:hAnsi="Arial" w:eastAsia="Arial" w:cs="Arial"/>
       <w:i/>
       <w:iCs/>
-      <w:color w:val="111111"/>
+      <w:color w:val="1B1B1F"/>
     </w:rPr>
   </w:style>
   <w:style w:type="character" w:customStyle="1" w:styleId="Heading9Char">
@@ -1530,8 +1556,8 @@
     <w:semiHidden/>
     <w:rsid w:val="00A10FD9"/>
     <w:rPr>
-      <w:rFonts w:ascii="Calibri" w:hAnsi="Calibri" w:eastAsia="Calibri" w:cs="Calibri"/>
-      <w:color w:val="111111"/>
+      <w:rFonts w:ascii="Arial" w:hAnsi="Arial" w:eastAsia="Arial" w:cs="Arial"/>
+      <w:color w:val="1B1B1F"/>
     </w:rPr>
   </w:style>
   <w:style w:type="paragraph" w:styleId="BlockText">
@@ -1652,7 +1678,7 @@
     <w:name w:val="Verbatim Char"/>
     <w:basedOn w:val="BodyTextChar"/>
     <w:rPr>
-      <w:rFonts w:ascii="Calibri" w:hAnsi="Calibri" w:eastAsia="Calibri" w:cs="Calibri"/>
+      <w:rFonts w:ascii="Arial" w:hAnsi="Arial" w:eastAsia="Arial" w:cs="Arial"/>
       <w:sz w:val="22"/>
     </w:rPr>
   </w:style>
@@ -1670,8 +1696,11 @@
   <w:style w:type="character" w:styleId="Hyperlink">
     <w:name w:val="Hyperlink"/>
     <w:basedOn w:val="BodyTextChar"/>
-    <w:rPr>
-      <w:color w:val="1A4F8A"/>
+    <w:uiPriority w:val="99"/>
+    <w:unhideWhenUsed/>
+    <w:rPr>
+      <w:color w:val="1F4F8F"/>
+      <w:u w:val="none"/>
     </w:rPr>
   </w:style>
   <w:style w:type="paragraph" w:styleId="TOCHeading">
@@ -1686,24 +1715,35 @@
       <w:outlineLvl w:val="9"/>
     </w:pPr>
     <w:rPr>
-      <w:rFonts w:ascii="Calibri" w:hAnsi="Calibri" w:eastAsia="Calibri" w:cs="Calibri"/>
+      <w:rFonts w:ascii="Arial" w:hAnsi="Arial" w:eastAsia="Arial" w:cs="Arial"/>
       <w:b w:val="0"/>
       <w:bCs w:val="0"/>
-      <w:color w:val="111111"/>
+      <w:color w:val="1B1B1F"/>
     </w:rPr>
   </w:style>
   <w:style w:type="paragraph" w:customStyle="1" w:styleId="Dates">
     <w:name w:val="Dates"/>
     <w:basedOn w:val="BodyText"/>
+    <w:next w:val="Compact"/>
     <w:qFormat/>
     <w:pPr>
       <w:keepNext/>
-      <w:spacing w:before="0" w:after="40"/>
-    </w:pPr>
-    <w:rPr>
-      <w:color w:val="444444"/>
-      <w:sz w:val="19"/>
-      <w:szCs w:val="19"/>
+      <w:keepLines/>
+      <w:spacing w:before="0" w:after="30" w:line="230" w:lineRule="exact"/>
+    </w:pPr>
+    <w:rPr>
+      <w:color w:val="5C6370"/>
+      <w:sz w:val="18"/>
+      <w:szCs w:val="18"/>
+    </w:rPr>
+  </w:style>
+  <w:style w:type="character" w:customStyle="1" w:styleId="RoleDates">
+    <w:name w:val="Role Dates"/>
+    <w:basedOn w:val="DefaultParagraphFont"/>
+    <w:rPr>
+      <w:color w:val="5C6370"/>
+      <w:sz w:val="18"/>
+      <w:szCs w:val="18"/>
     </w:rPr>
   </w:style>
   <w:style w:type="paragraph" w:customStyle="1" w:styleId="SourceCode">
@@ -1986,108 +2026,14 @@
     </a:clrScheme>
     <a:fontScheme name="Office">
       <a:majorFont>
-        <a:latin typeface="Aptos Display" panose="02110004020202020204"/>
+        <a:latin typeface="Arial"/>
         <a:ea typeface=""/>
         <a:cs typeface=""/>
-        <a:font script="Jpan" typeface="游ゴシック Light"/>
-        <a:font script="Hang" typeface="맑은 고딕"/>
-        <a:font script="Hans" typeface="等线 Light"/>
-        <a:font script="Hant" typeface="新細明體"/>
-        <a:font script="Arab" typeface="Times New Roman"/>
-        <a:font script="Hebr" typeface="Times New Roman"/>
-        <a:font script="Thai" typeface="Angsana New"/>
-        <a:font script="Ethi" typeface="Nyala"/>
-        <a:font script="Beng" typeface="Vrinda"/>
-        <a:font script="Gujr" typeface="Shruti"/>
-        <a:font script="Khmr" typeface="MoolBoran"/>
-        <a:font script="Knda" typeface="Tunga"/>
-        <a:font script="Guru" typeface="Raavi"/>
-        <a:font script="Cans" typeface="Euphemia"/>
-        <a:font script="Cher" typeface="Plantagenet Cherokee"/>
-        <a:font script="Yiii" typeface="Microsoft Yi Baiti"/>
-        <a:font script="Tibt" typeface="Microsoft Himalaya"/>
-        <a:font script="Thaa" typeface="MV Boli"/>
-        <a:font script="Deva" typeface="Mangal"/>
-        <a:font script="Telu" typeface="Gautami"/>
-        <a:font script="Taml" typeface="Latha"/>
-        <a:font script="Syrc" typeface="Estrangelo Edessa"/>
-        <a:font script="Orya" typeface="Kalinga"/>
-        <a:font script="Mlym" typeface="Kartika"/>
-        <a:font script="Laoo" typeface="DokChampa"/>
-        <a:font script="Sinh" typeface="Iskoola Pota"/>
-        <a:font script="Mong" typeface="Mongolian Baiti"/>
-        <a:font script="Viet" typeface="Times New Roman"/>
-        <a:font script="Uigh" typeface="Microsoft Uighur"/>
-        <a:font script="Geor" typeface="Sylfaen"/>
-        <a:font script="Armn" typeface="Arial"/>
-        <a:font script="Bugi" typeface="Leelawadee UI"/>
-        <a:font script="Bopo" typeface="Microsoft JhengHei"/>
-        <a:font script="Java" typeface="Javanese Text"/>
-        <a:font script="Lisu" typeface="Segoe UI"/>
-        <a:font script="Mymr" typeface="Myanmar Text"/>
-        <a:font script="Nkoo" typeface="Ebrima"/>
-        <a:font script="Olck" typeface="Nirmala UI"/>
-        <a:font script="Osma" typeface="Ebrima"/>
-        <a:font script="Phag" typeface="Phagspa"/>
-        <a:font script="Syrn" typeface="Estrangelo Edessa"/>
-        <a:font script="Syrj" typeface="Estrangelo Edessa"/>
-        <a:font script="Syre" typeface="Estrangelo Edessa"/>
-        <a:font script="Sora" typeface="Nirmala UI"/>
-        <a:font script="Tale" typeface="Microsoft Tai Le"/>
-        <a:font script="Talu" typeface="Microsoft New Tai Lue"/>
-        <a:font script="Tfng" typeface="Ebrima"/>
       </a:majorFont>
       <a:minorFont>
-        <a:latin typeface="Aptos" panose="02110004020202020204"/>
+        <a:latin typeface="Arial"/>
         <a:ea typeface=""/>
         <a:cs typeface=""/>
-        <a:font script="Jpan" typeface="游明朝"/>
-        <a:font script="Hang" typeface="맑은 고딕"/>
-        <a:font script="Hans" typeface="等线"/>
-        <a:font script="Hant" typeface="新細明體"/>
-        <a:font script="Arab" typeface="Arial"/>
-        <a:font script="Hebr" typeface="Arial"/>
-        <a:font script="Thai" typeface="Cordia New"/>
-        <a:font script="Ethi" typeface="Nyala"/>
-        <a:font script="Beng" typeface="Vrinda"/>
-        <a:font script="Gujr" typeface="Shruti"/>
-        <a:font script="Khmr" typeface="DaunPenh"/>
-        <a:font script="Knda" typeface="Tunga"/>
-        <a:font script="Guru" typeface="Raavi"/>
-        <a:font script="Cans" typeface="Euphemia"/>
-        <a:font script="Cher" typeface="Plantagenet Cherokee"/>
-        <a:font script="Yiii" typeface="Microsoft Yi Baiti"/>
-        <a:font script="Tibt" typeface="Microsoft Himalaya"/>
-        <a:font script="Thaa" typeface="MV Boli"/>
-        <a:font script="Deva" typeface="Mangal"/>
-        <a:font script="Telu" typeface="Gautami"/>
-        <a:font script="Taml" typeface="Latha"/>
-        <a:font script="Syrc" typeface="Estrangelo Edessa"/>
-        <a:font script="Orya" typeface="Kalinga"/>
-        <a:font script="Mlym" typeface="Kartika"/>
-        <a:font script="Laoo" typeface="DokChampa"/>
-        <a:font script="Sinh" typeface="Iskoola Pota"/>
-        <a:font script="Mong" typeface="Mongolian Baiti"/>
-        <a:font script="Viet" typeface="Arial"/>
-        <a:font script="Uigh" typeface="Microsoft Uighur"/>
-        <a:font script="Geor" typeface="Sylfaen"/>
-        <a:font script="Armn" typeface="Arial"/>
-        <a:font script="Bugi" typeface="Leelawadee UI"/>
-        <a:font script="Bopo" typeface="Microsoft JhengHei"/>
-        <a:font script="Java" typeface="Javanese Text"/>
-        <a:font script="Lisu" typeface="Segoe UI"/>
-        <a:font script="Mymr" typeface="Myanmar Text"/>
-        <a:font script="Nkoo" typeface="Ebrima"/>
-        <a:font script="Olck" typeface="Nirmala UI"/>
-        <a:font script="Osma" typeface="Ebrima"/>
-        <a:font script="Phag" typeface="Phagspa"/>
-        <a:font script="Syrn" typeface="Estrangelo Edessa"/>
-        <a:font script="Syrj" typeface="Estrangelo Edessa"/>
-        <a:font script="Syre" typeface="Estrangelo Edessa"/>
-        <a:font script="Sora" typeface="Nirmala UI"/>
-        <a:font script="Tale" typeface="Microsoft Tai Le"/>
-        <a:font script="Talu" typeface="Microsoft New Tai Lue"/>
-        <a:font script="Tfng" typeface="Ebrima"/>
       </a:minorFont>
     </a:fontScheme>
     <a:fmtScheme name="Office">

</xml_diff>

<commit_message>
resume: two-page layout with more breathing room
10.5pt body, wider margins and clear gaps between roles and sections in
both the PDF and docx. Roles never split across the page break, and date
ranges never wrap mid-range.

Co-Authored-By: Claude Opus 5.5 <noreply@anthropic.com>
</commit_message>
<xml_diff>
--- a/frontend/public/Samantha_Hughes_Resume.docx
+++ b/frontend/public/Samantha_Hughes_Resume.docx
@@ -283,7 +283,7 @@
         <w:rPr>
           <w:rStyle w:val="RoleDates"/>
         </w:rPr>
-        <w:t xml:space="preserve">Sep 2025 -&gt; Present</w:t>
+        <w:t xml:space="preserve">Sep 2025 -&gt; Present</w:t>
       </w:r>
       <w:bookmarkEnd w:id="19"/>
     </w:p>
@@ -437,7 +437,7 @@
         <w:rPr>
           <w:rStyle w:val="RoleDates"/>
         </w:rPr>
-        <w:t xml:space="preserve">Mar 2025 -&gt; Sep 2025</w:t>
+        <w:t xml:space="preserve">Mar 2025 -&gt; Sep 2025</w:t>
       </w:r>
       <w:bookmarkEnd w:id="22"/>
     </w:p>
@@ -500,7 +500,7 @@
         <w:rPr>
           <w:rStyle w:val="RoleDates"/>
         </w:rPr>
-        <w:t xml:space="preserve">Jun 2024 -&gt; Mar 2025</w:t>
+        <w:t xml:space="preserve">Jun 2024 -&gt; Mar 2025</w:t>
       </w:r>
       <w:bookmarkEnd w:id="23"/>
     </w:p>
@@ -551,7 +551,7 @@
         <w:rPr>
           <w:rStyle w:val="RoleDates"/>
         </w:rPr>
-        <w:t xml:space="preserve">Mar 2021 -&gt; May 2024</w:t>
+        <w:t xml:space="preserve">Mar 2021 -&gt; May 2024</w:t>
       </w:r>
       <w:bookmarkEnd w:id="24"/>
     </w:p>
@@ -657,7 +657,7 @@
         <w:rPr>
           <w:rStyle w:val="RoleDates"/>
         </w:rPr>
-        <w:t xml:space="preserve">May 2019 -&gt; Mar 2021</w:t>
+        <w:t xml:space="preserve">May 2019 -&gt; Mar 2021</w:t>
       </w:r>
       <w:bookmarkEnd w:id="27"/>
     </w:p>
@@ -708,7 +708,7 @@
         <w:rPr>
           <w:rStyle w:val="RoleDates"/>
         </w:rPr>
-        <w:t xml:space="preserve">Feb 2018 -&gt; May 2019</w:t>
+        <w:t xml:space="preserve">Feb 2018 -&gt; May 2019</w:t>
       </w:r>
       <w:bookmarkEnd w:id="28"/>
     </w:p>
@@ -759,7 +759,7 @@
         <w:rPr>
           <w:rStyle w:val="RoleDates"/>
         </w:rPr>
-        <w:t xml:space="preserve">Apr 2017 -&gt; Feb 2018</w:t>
+        <w:t xml:space="preserve">Apr 2017 -&gt; Feb 2018</w:t>
       </w:r>
       <w:bookmarkEnd w:id="29"/>
     </w:p>
@@ -798,7 +798,7 @@
         <w:numRestart w:val="eachSect"/>
       </w:footnotePr>
       <w:pgSz w:w="12240" w:h="15840"/>
-      <w:pgMar w:top="720" w:right="792" w:bottom="576" w:left="792" w:header="360" w:footer="360" w:gutter="0"/>
+      <w:pgMar w:top="1008" w:right="1008" w:bottom="1008" w:left="1008" w:header="360" w:footer="360" w:gutter="0"/>
       <w:cols w:space="720"/>
     </w:sectPr>
   </w:body>
@@ -1045,8 +1045,8 @@
     <w:rPrDefault>
       <w:rPr>
         <w:rFonts w:ascii="Arial" w:hAnsi="Arial" w:eastAsia="Arial" w:cs="Arial"/>
-        <w:sz w:val="19"/>
-        <w:szCs w:val="19"/>
+        <w:sz w:val="21"/>
+        <w:szCs w:val="21"/>
         <w:lang w:val="en-US" w:eastAsia="en-US" w:bidi="ar-SA"/>
       </w:rPr>
     </w:rPrDefault>
@@ -1062,13 +1062,13 @@
     <w:qFormat/>
     <w:pPr>
       <w:widowControl/>
-      <w:spacing w:before="0" w:after="0" w:line="230" w:lineRule="exact"/>
+      <w:spacing w:before="0" w:after="0" w:line="300" w:lineRule="exact"/>
     </w:pPr>
     <w:rPr>
       <w:rFonts w:ascii="Arial" w:hAnsi="Arial" w:eastAsia="Arial" w:cs="Arial"/>
       <w:color w:val="1B1B1F"/>
-      <w:sz w:val="19"/>
-      <w:szCs w:val="19"/>
+      <w:sz w:val="21"/>
+      <w:szCs w:val="21"/>
       <w:lang w:val="en-US"/>
     </w:rPr>
   </w:style>
@@ -1093,7 +1093,7 @@
     <w:basedOn w:val="BodyText"/>
     <w:qFormat/>
     <w:pPr>
-      <w:spacing w:before="0" w:after="20"/>
+      <w:spacing w:before="0" w:after="80"/>
     </w:pPr>
   </w:style>
   <w:style w:type="paragraph" w:styleId="Title">
@@ -1114,8 +1114,8 @@
       <w:bCs/>
       <w:color w:val="1B1B1F"/>
       <w:kern w:val="28"/>
-      <w:sz w:val="36"/>
-      <w:szCs w:val="36"/>
+      <w:sz w:val="40"/>
+      <w:szCs w:val="40"/>
     </w:rPr>
   </w:style>
   <w:style w:type="character" w:customStyle="1" w:styleId="TitleChar">
@@ -1128,8 +1128,8 @@
       <w:bCs/>
       <w:color w:val="1B1B1F"/>
       <w:kern w:val="28"/>
-      <w:sz w:val="36"/>
-      <w:szCs w:val="36"/>
+      <w:sz w:val="40"/>
+      <w:szCs w:val="40"/>
     </w:rPr>
   </w:style>
   <w:style w:type="paragraph" w:styleId="Subtitle">
@@ -1253,8 +1253,8 @@
       <w:bCs/>
       <w:color w:val="1B1B1F"/>
       <w:kern w:val="28"/>
-      <w:sz w:val="36"/>
-      <w:szCs w:val="36"/>
+      <w:sz w:val="40"/>
+      <w:szCs w:val="40"/>
     </w:rPr>
   </w:style>
   <w:style w:type="paragraph" w:styleId="Heading2">
@@ -1270,7 +1270,7 @@
       <w:pBdr>
         <w:bottom w:val="single" w:sz="4" w:space="1" w:color="C4C8CF"/>
       </w:pBdr>
-      <w:spacing w:before="140" w:after="60" w:line="240" w:lineRule="auto"/>
+      <w:spacing w:before="320" w:after="60" w:line="240" w:lineRule="auto"/>
       <w:outlineLvl w:val="1"/>
     </w:pPr>
     <w:rPr>
@@ -1280,8 +1280,8 @@
       <w:caps/>
       <w:color w:val="1F4F8F"/>
       <w:spacing w:val="16"/>
-      <w:sz w:val="20"/>
-      <w:szCs w:val="20"/>
+      <w:sz w:val="22"/>
+      <w:szCs w:val="22"/>
     </w:rPr>
   </w:style>
   <w:style w:type="paragraph" w:styleId="Heading3">
@@ -1295,16 +1295,16 @@
       <w:keepNext/>
       <w:keepLines/>
       <w:tabs>
-        <w:tab w:val="right" w:pos="10656"/>
+        <w:tab w:val="right" w:pos="10224"/>
       </w:tabs>
-      <w:spacing w:before="100" w:after="0" w:line="260" w:lineRule="exact"/>
+      <w:spacing w:before="220" w:after="0" w:line="300" w:lineRule="exact"/>
       <w:outlineLvl w:val="2"/>
     </w:pPr>
     <w:rPr>
       <w:rFonts w:ascii="Arial" w:hAnsi="Arial" w:eastAsia="Arial" w:cs="Arial"/>
       <w:color w:val="1B1B1F"/>
-      <w:sz w:val="20"/>
-      <w:szCs w:val="20"/>
+      <w:sz w:val="22"/>
+      <w:szCs w:val="22"/>
     </w:rPr>
   </w:style>
   <w:style w:type="paragraph" w:styleId="Heading4">
@@ -1450,8 +1450,8 @@
       <w:bCs/>
       <w:color w:val="1B1B1F"/>
       <w:kern w:val="28"/>
-      <w:sz w:val="36"/>
-      <w:szCs w:val="36"/>
+      <w:sz w:val="40"/>
+      <w:szCs w:val="40"/>
     </w:rPr>
   </w:style>
   <w:style w:type="character" w:customStyle="1" w:styleId="Heading2Char">
@@ -1466,8 +1466,8 @@
       <w:caps/>
       <w:color w:val="1F4F8F"/>
       <w:spacing w:val="16"/>
-      <w:sz w:val="20"/>
-      <w:szCs w:val="20"/>
+      <w:sz w:val="22"/>
+      <w:szCs w:val="22"/>
     </w:rPr>
   </w:style>
   <w:style w:type="character" w:customStyle="1" w:styleId="Heading3Char">
@@ -1478,8 +1478,8 @@
     <w:rPr>
       <w:rFonts w:ascii="Arial" w:hAnsi="Arial" w:eastAsia="Arial" w:cs="Arial"/>
       <w:color w:val="1B1B1F"/>
-      <w:sz w:val="20"/>
-      <w:szCs w:val="20"/>
+      <w:sz w:val="22"/>
+      <w:szCs w:val="22"/>
     </w:rPr>
   </w:style>
   <w:style w:type="character" w:customStyle="1" w:styleId="Heading4Char">
@@ -1729,12 +1729,12 @@
     <w:pPr>
       <w:keepNext/>
       <w:keepLines/>
-      <w:spacing w:before="0" w:after="30" w:line="230" w:lineRule="exact"/>
+      <w:spacing w:before="0" w:after="30" w:line="280" w:lineRule="exact"/>
     </w:pPr>
     <w:rPr>
       <w:color w:val="5C6370"/>
-      <w:sz w:val="18"/>
-      <w:szCs w:val="18"/>
+      <w:sz w:val="20"/>
+      <w:szCs w:val="20"/>
     </w:rPr>
   </w:style>
   <w:style w:type="character" w:customStyle="1" w:styleId="RoleDates">
@@ -1742,8 +1742,8 @@
     <w:basedOn w:val="DefaultParagraphFont"/>
     <w:rPr>
       <w:color w:val="5C6370"/>
-      <w:sz w:val="18"/>
-      <w:szCs w:val="18"/>
+      <w:sz w:val="20"/>
+      <w:szCs w:val="20"/>
     </w:rPr>
   </w:style>
   <w:style w:type="paragraph" w:customStyle="1" w:styleId="SourceCode">

</xml_diff>

<commit_message>
resume: add S3, EC2, Aurora and IAM to skills
Co-Authored-By: Claude Opus 5.5 <noreply@anthropic.com>
</commit_message>
<xml_diff>
--- a/frontend/public/Samantha_Hughes_Resume.docx
+++ b/frontend/public/Samantha_Hughes_Resume.docx
@@ -191,7 +191,7 @@
         <w:t xml:space="preserve"> </w:t>
       </w:r>
       <w:r>
-        <w:t xml:space="preserve">EKS, Karpenter, KEDA, kopf operators, Pulumi, Terraform</w:t>
+        <w:t xml:space="preserve">EKS, EC2, Aurora, IAM, Karpenter, KEDA, kopf operators, Pulumi, Terraform</w:t>
       </w:r>
     </w:p>
     <w:p>
@@ -213,7 +213,7 @@
         <w:t xml:space="preserve"> </w:t>
       </w:r>
       <w:r>
-        <w:t xml:space="preserve">Postgres, MongoDB, RabbitMQ, Dask, Databricks/Spark</w:t>
+        <w:t xml:space="preserve">S3, Postgres, MongoDB, RabbitMQ, Dask, Databricks/Spark</w:t>
       </w:r>
     </w:p>
     <w:p>

</xml_diff>

<commit_message>
resume: add WebBrick Systems (2009 -> 2011)
Co-Authored-By: Claude Opus 5.5 <noreply@anthropic.com>
</commit_message>
<xml_diff>
--- a/frontend/public/Samantha_Hughes_Resume.docx
+++ b/frontend/public/Samantha_Hughes_Resume.docx
@@ -777,13 +777,64 @@
     </w:p>
     <w:p>
       <w:pPr>
+        <w:pStyle w:val="Heading3"/>
+      </w:pPr>
+      <w:bookmarkStart w:id="30" w:name="_a7ef1f2499656fd999d38ff164cdd15cbba5847"/>
+      <w:r>
+        <w:rPr>
+          <w:b/>
+          <w:bCs/>
+        </w:rPr>
+        <w:t xml:space="preserve">WebBrick Systems</w:t>
+      </w:r>
+      <w:r>
+        <w:t xml:space="preserve"> </w:t>
+      </w:r>
+      <w:r>
+        <w:t xml:space="preserve">-</w:t>
+      </w:r>
+      <w:r>
+        <w:t xml:space="preserve"> </w:t>
+      </w:r>
+      <w:r>
+        <w:rPr>
+          <w:i/>
+          <w:iCs/>
+        </w:rPr>
+        <w:t xml:space="preserve">Software Engineer</w:t>
+      </w:r>
+      <w:r>
+        <w:tab/>
+      </w:r>
+      <w:r>
+        <w:rPr>
+          <w:rStyle w:val="RoleDates"/>
+        </w:rPr>
+        <w:t xml:space="preserve">Jul 2009 -&gt; Jan 2011</w:t>
+      </w:r>
+      <w:bookmarkEnd w:id="30"/>
+    </w:p>
+    <w:p>
+      <w:pPr>
+        <w:pStyle w:val="Compact"/>
+        <w:numPr>
+          <w:ilvl w:val="0"/>
+          <w:numId w:val="1009"/>
+        </w:numPr>
+      </w:pPr>
+      <w:r>
+        <w:t xml:space="preserve">Integrated high-end media systems with home automation equipment.</w:t>
+      </w:r>
+    </w:p>
+    <w:p>
+      <w:pPr>
         <w:pStyle w:val="Heading2"/>
       </w:pPr>
-      <w:bookmarkStart w:id="30" w:name="_education"/>
+      <w:bookmarkStart w:id="31" w:name="_education"/>
       <w:r>
         <w:t xml:space="preserve">Education</w:t>
       </w:r>
-      <w:bookmarkEnd w:id="30"/>
+      <w:bookmarkEnd w:id="31"/>
     </w:p>
     <w:p>
       <w:pPr>
@@ -1034,6 +1085,9 @@
     <w:abstractNumId w:val="991"/>
   </w:num>
   <w:num w:numId="1008">
+    <w:abstractNumId w:val="991"/>
+  </w:num>
+  <w:num w:numId="1009">
     <w:abstractNumId w:val="991"/>
   </w:num>
 </w:numbering>

</xml_diff>